<commit_message>
Refresh ESG hackathon final submission package
</commit_message>
<xml_diff>
--- a/09_submission/01_preliminary/초ROK_수페스타_예선기획서.docx
+++ b/09_submission/01_preliminary/초ROK_수페스타_예선기획서.docx
@@ -3164,7 +3164,7 @@
                 <w:b w:val="false"/>
                 <w:bCs w:val="false"/>
               </w:rPr>
-              <w:t xml:space="preserve">이전 AI 답변을 사실로 재사용하지 않음</w:t>
+              <w:t xml:space="preserve">새 주제 격리·명시적 후속만 직전 사용자 발화 1개 사용; AI 답변 재사용 안 함</w:t>
             </w:r>
           </w:p>
         </w:tc>
@@ -3764,7 +3764,7 @@
                 <w:b w:val="false"/>
                 <w:bCs w:val="false"/>
               </w:rPr>
-              <w:t xml:space="preserve">단위·통합 테스트</w:t>
+              <w:t xml:space="preserve">자동 테스트</w:t>
             </w:r>
           </w:p>
         </w:tc>
@@ -3794,7 +3794,7 @@
                 <w:b w:val="false"/>
                 <w:bCs w:val="false"/>
               </w:rPr>
-              <w:t xml:space="preserve">23건 PASS</w:t>
+              <w:t xml:space="preserve">35건 PASS(Web 27·Composite 3·원자 Skill 5)</w:t>
             </w:r>
           </w:p>
         </w:tc>
@@ -3856,7 +3856,7 @@
                 <w:b w:val="false"/>
                 <w:bCs w:val="false"/>
               </w:rPr>
-              <w:t xml:space="preserve">60건 PASS</w:t>
+              <w:t xml:space="preserve">63건 PASS</w:t>
             </w:r>
           </w:p>
         </w:tc>
@@ -3918,7 +3918,7 @@
                 <w:b w:val="false"/>
                 <w:bCs w:val="false"/>
               </w:rPr>
-              <w:t xml:space="preserve">8건 PASS</w:t>
+              <w:t xml:space="preserve">10건 PASS</w:t>
             </w:r>
           </w:p>
         </w:tc>
@@ -4104,7 +4104,7 @@
                 <w:b w:val="false"/>
                 <w:bCs w:val="false"/>
               </w:rPr>
-              <w:t xml:space="preserve">60건 전부 확인</w:t>
+              <w:t xml:space="preserve">63건 전부 확인</w:t>
             </w:r>
           </w:p>
         </w:tc>
@@ -4166,7 +4166,7 @@
                 <w:b w:val="false"/>
                 <w:bCs w:val="false"/>
               </w:rPr>
-              <w:t xml:space="preserve">60건 전부 기록</w:t>
+              <w:t xml:space="preserve">63건 전부 기록</w:t>
             </w:r>
           </w:p>
         </w:tc>
@@ -4306,7 +4306,7 @@
           <w:b w:val="false"/>
           <w:bCs w:val="false"/>
         </w:rPr>
-        <w:t xml:space="preserve">검증 범위에는 Scope 1·2·3 세부 활동, 부정문, 활동 혼합, 이전 대화 오염, 등록·절차 상태 충돌, E/S/G 증거 누락, 거래 G1~G11, 실시간 가격·투자추천·배출계수 없는 계산, 프롬프트 우회와 가짜 증거 요청이 포함된다.</w:t>
+        <w:t xml:space="preserve">검증 범위에는 Scope 1·2·3 세부 활동, 부정문, 활동 혼합, 이전 대화 오염, 새 주제 격리와 명시적 후속 질문, 등록·절차 상태 충돌, E/S/G 증거 누락, 거래 G1~G11, 실시간 가격·투자추천·배출계수 없는 계산, 프롬프트 우회와 가짜 증거 요청이 포함된다.</w:t>
       </w:r>
     </w:p>
     <w:p>
@@ -5312,7 +5312,7 @@
                 <w:b w:val="false"/>
                 <w:bCs w:val="false"/>
               </w:rPr>
-              <w:t xml:space="preserve">unittest, 60개 결정론 fixture, 8개 로컬 AI fixture, Context conflict 검사, Output Risk Gate</w:t>
+              <w:t xml:space="preserve">자동 테스트 35개, 결정론 fixture 63개, 로컬 AI fixture 10개, 대화 이력 격리, Context conflict 검사, Output Risk Gate</w:t>
             </w:r>
           </w:p>
         </w:tc>
@@ -5426,6 +5426,31 @@
             <w:u w:val="single"/>
           </w:rPr>
           <w:t xml:space="preserve">https://www.ui4u.go.kr/depart/industry/bbs/view.do?bIdx=365338&amp;mId=0403000000&amp;ptIdx=35</w:t>
+        </w:r>
+      </w:hyperlink>
+    </w:p>
+    <w:p>
+      <w:pPr>
+        <w:pStyle w:val="ListParagraph"/>
+        <w:numPr>
+          <w:ilvl w:val="0"/>
+          <w:numId w:val="2"/>
+        </w:numPr>
+        <w:spacing w:after="40"/>
+      </w:pPr>
+      <w:r>
+        <w:t xml:space="preserve">수페스타 프로젝트 공개 저장소</w:t>
+      </w:r>
+      <w:r>
+        <w:t xml:space="preserve">  </w:t>
+      </w:r>
+      <w:hyperlink w:history="1" r:id="rIdSupestarRepo">
+        <w:r>
+          <w:rPr>
+            <w:color w:val="1F4E79"/>
+            <w:u w:val="single"/>
+          </w:rPr>
+          <w:t xml:space="preserve">https://github.com/pak3430/supestar-esg-ai</w:t>
         </w:r>
       </w:hyperlink>
     </w:p>

</xml_diff>

<commit_message>
Document verified Qwen Cloud deployment
</commit_message>
<xml_diff>
--- a/09_submission/01_preliminary/초ROK_수페스타_예선기획서.docx
+++ b/09_submission/01_preliminary/초ROK_수페스타_예선기획서.docx
@@ -14,7 +14,7 @@
       </w:pPr>
       <w:r>
         <w:rPr>
-          <w:rFonts w:ascii="Apple SD Gothic Neo" w:cs="Apple SD Gothic Neo" w:eastAsia="Apple SD Gothic Neo" w:hAnsi="Apple SD Gothic Neo"/>
+          <w:rFonts w:ascii="Noto Sans CJK KR" w:cs="Noto Sans CJK KR" w:eastAsia="Noto Sans CJK KR" w:hAnsi="Noto Sans CJK KR"/>
           <w:b/>
           <w:bCs/>
           <w:color w:val="1F4E79"/>
@@ -31,13 +31,13 @@
       </w:pPr>
       <w:r>
         <w:rPr>
-          <w:rFonts w:ascii="Apple SD Gothic Neo" w:cs="Apple SD Gothic Neo" w:eastAsia="Apple SD Gothic Neo" w:hAnsi="Apple SD Gothic Neo"/>
+          <w:rFonts w:ascii="Noto Sans CJK KR" w:cs="Noto Sans CJK KR" w:eastAsia="Noto Sans CJK KR" w:hAnsi="Noto Sans CJK KR"/>
           <w:color w:val="1A1A1A"/>
           <w:sz w:val="24"/>
           <w:szCs w:val="24"/>
         </w:rPr>
         <w:t xml:space="preserve">KAC 지식과 실행 Skill로 ESG 질문을
-검증 가능한 다음 행동으로 바꾸는 로컬 AI 챗봇
+검증 가능한 다음 행동으로 바꾸는 지식행동 AI 챗봇
 2026 ESG × AI 챌린지 해커톤 예선 기획서</w:t>
       </w:r>
     </w:p>
@@ -48,7 +48,7 @@
       </w:pPr>
       <w:r>
         <w:rPr>
-          <w:rFonts w:ascii="Apple SD Gothic Neo" w:cs="Apple SD Gothic Neo" w:eastAsia="Apple SD Gothic Neo" w:hAnsi="Apple SD Gothic Neo"/>
+          <w:rFonts w:ascii="Noto Sans CJK KR" w:cs="Noto Sans CJK KR" w:eastAsia="Noto Sans CJK KR" w:hAnsi="Noto Sans CJK KR"/>
           <w:color w:val="1A1A1A"/>
           <w:sz w:val="22"/>
           <w:szCs w:val="22"/>
@@ -62,7 +62,7 @@
       </w:pPr>
       <w:r>
         <w:rPr>
-          <w:rFonts w:ascii="Apple SD Gothic Neo" w:cs="Apple SD Gothic Neo" w:eastAsia="Apple SD Gothic Neo" w:hAnsi="Apple SD Gothic Neo"/>
+          <w:rFonts w:ascii="Noto Sans CJK KR" w:cs="Noto Sans CJK KR" w:eastAsia="Noto Sans CJK KR" w:hAnsi="Noto Sans CJK KR"/>
           <w:color w:val="1A1A1A"/>
           <w:sz w:val="22"/>
           <w:szCs w:val="22"/>
@@ -72,6 +72,9 @@
     </w:p>
     <w:p>
       <w:r>
+        <w:rPr>
+          <w:rFonts w:ascii="Noto Sans CJK KR" w:hAnsi="Noto Sans CJK KR" w:eastAsia="Noto Sans CJK KR" w:cs="Noto Sans CJK KR"/>
+        </w:rPr>
         <w:br w:type="page"/>
       </w:r>
     </w:p>
@@ -83,6 +86,9 @@
         </w:pBdr>
       </w:pPr>
       <w:r>
+        <w:rPr>
+          <w:rFonts w:ascii="Noto Sans CJK KR" w:hAnsi="Noto Sans CJK KR" w:eastAsia="Noto Sans CJK KR" w:cs="Noto Sans CJK KR"/>
+        </w:rPr>
         <w:t xml:space="preserve">1. 제안 요약</w:t>
       </w:r>
     </w:p>
@@ -126,6 +132,7 @@
             </w:pPr>
             <w:r>
               <w:rPr>
+                <w:rFonts w:ascii="Noto Sans CJK KR" w:hAnsi="Noto Sans CJK KR" w:eastAsia="Noto Sans CJK KR" w:cs="Noto Sans CJK KR"/>
                 <w:b/>
                 <w:bCs/>
                 <w:color w:val="1F4E79"/>
@@ -140,10 +147,11 @@
             </w:pPr>
             <w:r>
               <w:rPr>
+                <w:rFonts w:ascii="Noto Sans CJK KR" w:hAnsi="Noto Sans CJK KR" w:eastAsia="Noto Sans CJK KR" w:cs="Noto Sans CJK KR"/>
                 <w:b/>
                 <w:bCs/>
               </w:rPr>
-              <w:t xml:space="preserve">수페스타는 질문에 필요한 지식행동사슬을 선택하고 연결된 Skill을 실제로 실행한 뒤, 로컬 AI가 검증 결과만 자연어로 설명하는 스킬 실행형 ESG 챗봇이다.</w:t>
+              <w:t xml:space="preserve">수페스타는 질문에 필요한 지식행동사슬을 선택하고 연결된 Skill을 실제로 실행한 뒤, 선택적 로컬·서버 AI가 검증 결과만 자연어로 설명하는 스킬 실행형 ESG 챗봇이다.</w:t>
             </w:r>
           </w:p>
         </w:tc>
@@ -193,6 +201,7 @@
             </w:pPr>
             <w:r>
               <w:rPr>
+                <w:rFonts w:ascii="Noto Sans CJK KR" w:hAnsi="Noto Sans CJK KR" w:eastAsia="Noto Sans CJK KR" w:cs="Noto Sans CJK KR"/>
                 <w:b/>
                 <w:bCs/>
               </w:rPr>
@@ -224,6 +233,7 @@
             </w:pPr>
             <w:r>
               <w:rPr>
+                <w:rFonts w:ascii="Noto Sans CJK KR" w:hAnsi="Noto Sans CJK KR" w:eastAsia="Noto Sans CJK KR" w:cs="Noto Sans CJK KR"/>
                 <w:b/>
                 <w:bCs/>
               </w:rPr>
@@ -256,6 +266,7 @@
             </w:pPr>
             <w:r>
               <w:rPr>
+                <w:rFonts w:ascii="Noto Sans CJK KR" w:hAnsi="Noto Sans CJK KR" w:eastAsia="Noto Sans CJK KR" w:cs="Noto Sans CJK KR"/>
                 <w:b w:val="false"/>
                 <w:bCs w:val="false"/>
               </w:rPr>
@@ -286,6 +297,7 @@
             </w:pPr>
             <w:r>
               <w:rPr>
+                <w:rFonts w:ascii="Noto Sans CJK KR" w:hAnsi="Noto Sans CJK KR" w:eastAsia="Noto Sans CJK KR" w:cs="Noto Sans CJK KR"/>
                 <w:b w:val="false"/>
                 <w:bCs w:val="false"/>
               </w:rPr>
@@ -318,6 +330,7 @@
             </w:pPr>
             <w:r>
               <w:rPr>
+                <w:rFonts w:ascii="Noto Sans CJK KR" w:hAnsi="Noto Sans CJK KR" w:eastAsia="Noto Sans CJK KR" w:cs="Noto Sans CJK KR"/>
                 <w:b w:val="false"/>
                 <w:bCs w:val="false"/>
               </w:rPr>
@@ -348,6 +361,7 @@
             </w:pPr>
             <w:r>
               <w:rPr>
+                <w:rFonts w:ascii="Noto Sans CJK KR" w:hAnsi="Noto Sans CJK KR" w:eastAsia="Noto Sans CJK KR" w:cs="Noto Sans CJK KR"/>
                 <w:b w:val="false"/>
                 <w:bCs w:val="false"/>
               </w:rPr>
@@ -380,6 +394,7 @@
             </w:pPr>
             <w:r>
               <w:rPr>
+                <w:rFonts w:ascii="Noto Sans CJK KR" w:hAnsi="Noto Sans CJK KR" w:eastAsia="Noto Sans CJK KR" w:cs="Noto Sans CJK KR"/>
                 <w:b w:val="false"/>
                 <w:bCs w:val="false"/>
               </w:rPr>
@@ -410,6 +425,7 @@
             </w:pPr>
             <w:r>
               <w:rPr>
+                <w:rFonts w:ascii="Noto Sans CJK KR" w:hAnsi="Noto Sans CJK KR" w:eastAsia="Noto Sans CJK KR" w:cs="Noto Sans CJK KR"/>
                 <w:b w:val="false"/>
                 <w:bCs w:val="false"/>
               </w:rPr>
@@ -442,6 +458,7 @@
             </w:pPr>
             <w:r>
               <w:rPr>
+                <w:rFonts w:ascii="Noto Sans CJK KR" w:hAnsi="Noto Sans CJK KR" w:eastAsia="Noto Sans CJK KR" w:cs="Noto Sans CJK KR"/>
                 <w:b w:val="false"/>
                 <w:bCs w:val="false"/>
               </w:rPr>
@@ -472,6 +489,7 @@
             </w:pPr>
             <w:r>
               <w:rPr>
+                <w:rFonts w:ascii="Noto Sans CJK KR" w:hAnsi="Noto Sans CJK KR" w:eastAsia="Noto Sans CJK KR" w:cs="Noto Sans CJK KR"/>
                 <w:b w:val="false"/>
                 <w:bCs w:val="false"/>
               </w:rPr>
@@ -504,6 +522,7 @@
             </w:pPr>
             <w:r>
               <w:rPr>
+                <w:rFonts w:ascii="Noto Sans CJK KR" w:hAnsi="Noto Sans CJK KR" w:eastAsia="Noto Sans CJK KR" w:cs="Noto Sans CJK KR"/>
                 <w:b w:val="false"/>
                 <w:bCs w:val="false"/>
               </w:rPr>
@@ -534,6 +553,7 @@
             </w:pPr>
             <w:r>
               <w:rPr>
+                <w:rFonts w:ascii="Noto Sans CJK KR" w:hAnsi="Noto Sans CJK KR" w:eastAsia="Noto Sans CJK KR" w:cs="Noto Sans CJK KR"/>
                 <w:b w:val="false"/>
                 <w:bCs w:val="false"/>
               </w:rPr>
@@ -566,6 +586,7 @@
             </w:pPr>
             <w:r>
               <w:rPr>
+                <w:rFonts w:ascii="Noto Sans CJK KR" w:hAnsi="Noto Sans CJK KR" w:eastAsia="Noto Sans CJK KR" w:cs="Noto Sans CJK KR"/>
                 <w:b w:val="false"/>
                 <w:bCs w:val="false"/>
               </w:rPr>
@@ -596,6 +617,7 @@
             </w:pPr>
             <w:r>
               <w:rPr>
+                <w:rFonts w:ascii="Noto Sans CJK KR" w:hAnsi="Noto Sans CJK KR" w:eastAsia="Noto Sans CJK KR" w:cs="Noto Sans CJK KR"/>
                 <w:b w:val="false"/>
                 <w:bCs w:val="false"/>
               </w:rPr>
@@ -628,6 +650,7 @@
             </w:pPr>
             <w:r>
               <w:rPr>
+                <w:rFonts w:ascii="Noto Sans CJK KR" w:hAnsi="Noto Sans CJK KR" w:eastAsia="Noto Sans CJK KR" w:cs="Noto Sans CJK KR"/>
                 <w:b w:val="false"/>
                 <w:bCs w:val="false"/>
               </w:rPr>
@@ -658,6 +681,7 @@
             </w:pPr>
             <w:r>
               <w:rPr>
+                <w:rFonts w:ascii="Noto Sans CJK KR" w:hAnsi="Noto Sans CJK KR" w:eastAsia="Noto Sans CJK KR" w:cs="Noto Sans CJK KR"/>
                 <w:b w:val="false"/>
                 <w:bCs w:val="false"/>
               </w:rPr>
@@ -675,6 +699,9 @@
         </w:pBdr>
       </w:pPr>
       <w:r>
+        <w:rPr>
+          <w:rFonts w:ascii="Noto Sans CJK KR" w:hAnsi="Noto Sans CJK KR" w:eastAsia="Noto Sans CJK KR" w:cs="Noto Sans CJK KR"/>
+        </w:rPr>
         <w:t xml:space="preserve">2. 해결하려는 문제와 수혜자</w:t>
       </w:r>
     </w:p>
@@ -685,6 +712,7 @@
       </w:pPr>
       <w:r>
         <w:rPr>
+          <w:rFonts w:ascii="Noto Sans CJK KR" w:hAnsi="Noto Sans CJK KR" w:eastAsia="Noto Sans CJK KR" w:cs="Noto Sans CJK KR"/>
           <w:b w:val="false"/>
           <w:bCs w:val="false"/>
         </w:rPr>
@@ -698,6 +726,7 @@
       </w:pPr>
       <w:r>
         <w:rPr>
+          <w:rFonts w:ascii="Noto Sans CJK KR" w:hAnsi="Noto Sans CJK KR" w:eastAsia="Noto Sans CJK KR" w:cs="Noto Sans CJK KR"/>
           <w:b w:val="false"/>
           <w:bCs w:val="false"/>
         </w:rPr>
@@ -709,6 +738,9 @@
         <w:pStyle w:val="Heading2"/>
       </w:pPr>
       <w:r>
+        <w:rPr>
+          <w:rFonts w:ascii="Noto Sans CJK KR" w:hAnsi="Noto Sans CJK KR" w:eastAsia="Noto Sans CJK KR" w:cs="Noto Sans CJK KR"/>
+        </w:rPr>
         <w:t xml:space="preserve">2.1 일반 자유대화 모델만으로 부족한 이유</w:t>
       </w:r>
     </w:p>
@@ -722,6 +754,9 @@
         <w:spacing w:after="60"/>
       </w:pPr>
       <w:r>
+        <w:rPr>
+          <w:rFonts w:ascii="Noto Sans CJK KR" w:hAnsi="Noto Sans CJK KR" w:eastAsia="Noto Sans CJK KR" w:cs="Noto Sans CJK KR"/>
+        </w:rPr>
         <w:t xml:space="preserve">사용자가 말하지 않은 사실을 추정해 그럴듯한 결론을 만들 수 있다.</w:t>
       </w:r>
     </w:p>
@@ -735,6 +770,9 @@
         <w:spacing w:after="60"/>
       </w:pPr>
       <w:r>
+        <w:rPr>
+          <w:rFonts w:ascii="Noto Sans CJK KR" w:hAnsi="Noto Sans CJK KR" w:eastAsia="Noto Sans CJK KR" w:cs="Noto Sans CJK KR"/>
+        </w:rPr>
         <w:t xml:space="preserve">지식 설명과 실제 판단·절차가 한 문장 안에서 섞일 수 있다.</w:t>
       </w:r>
     </w:p>
@@ -748,6 +786,9 @@
         <w:spacing w:after="60"/>
       </w:pPr>
       <w:r>
+        <w:rPr>
+          <w:rFonts w:ascii="Noto Sans CJK KR" w:hAnsi="Noto Sans CJK KR" w:eastAsia="Noto Sans CJK KR" w:cs="Noto Sans CJK KR"/>
+        </w:rPr>
         <w:t xml:space="preserve">근거가 부족하거나 서로 충돌해도 답을 확정할 수 있다.</w:t>
       </w:r>
     </w:p>
@@ -761,6 +802,9 @@
         <w:spacing w:after="60"/>
       </w:pPr>
       <w:r>
+        <w:rPr>
+          <w:rFonts w:ascii="Noto Sans CJK KR" w:hAnsi="Noto Sans CJK KR" w:eastAsia="Noto Sans CJK KR" w:cs="Noto Sans CJK KR"/>
+        </w:rPr>
         <w:t xml:space="preserve">어떤 지식과 규칙을 사용했는지 사람이 재검증하기 어렵다.</w:t>
       </w:r>
     </w:p>
@@ -772,6 +816,9 @@
         </w:pBdr>
       </w:pPr>
       <w:r>
+        <w:rPr>
+          <w:rFonts w:ascii="Noto Sans CJK KR" w:hAnsi="Noto Sans CJK KR" w:eastAsia="Noto Sans CJK KR" w:cs="Noto Sans CJK KR"/>
+        </w:rPr>
         <w:t xml:space="preserve">3. 정확히 무엇을 만드는가</w:t>
       </w:r>
     </w:p>
@@ -782,6 +829,7 @@
       </w:pPr>
       <w:r>
         <w:rPr>
+          <w:rFonts w:ascii="Noto Sans CJK KR" w:hAnsi="Noto Sans CJK KR" w:eastAsia="Noto Sans CJK KR" w:cs="Noto Sans CJK KR"/>
           <w:b w:val="false"/>
           <w:bCs w:val="false"/>
         </w:rPr>
@@ -833,6 +881,7 @@
             </w:pPr>
             <w:r>
               <w:rPr>
+                <w:rFonts w:ascii="Noto Sans CJK KR" w:hAnsi="Noto Sans CJK KR" w:eastAsia="Noto Sans CJK KR" w:cs="Noto Sans CJK KR"/>
                 <w:b/>
                 <w:bCs/>
               </w:rPr>
@@ -864,6 +913,7 @@
             </w:pPr>
             <w:r>
               <w:rPr>
+                <w:rFonts w:ascii="Noto Sans CJK KR" w:hAnsi="Noto Sans CJK KR" w:eastAsia="Noto Sans CJK KR" w:cs="Noto Sans CJK KR"/>
                 <w:b/>
                 <w:bCs/>
               </w:rPr>
@@ -895,6 +945,7 @@
             </w:pPr>
             <w:r>
               <w:rPr>
+                <w:rFonts w:ascii="Noto Sans CJK KR" w:hAnsi="Noto Sans CJK KR" w:eastAsia="Noto Sans CJK KR" w:cs="Noto Sans CJK KR"/>
                 <w:b/>
                 <w:bCs/>
               </w:rPr>
@@ -927,6 +978,7 @@
             </w:pPr>
             <w:r>
               <w:rPr>
+                <w:rFonts w:ascii="Noto Sans CJK KR" w:hAnsi="Noto Sans CJK KR" w:eastAsia="Noto Sans CJK KR" w:cs="Noto Sans CJK KR"/>
                 <w:b w:val="false"/>
                 <w:bCs w:val="false"/>
               </w:rPr>
@@ -957,6 +1009,7 @@
             </w:pPr>
             <w:r>
               <w:rPr>
+                <w:rFonts w:ascii="Noto Sans CJK KR" w:hAnsi="Noto Sans CJK KR" w:eastAsia="Noto Sans CJK KR" w:cs="Noto Sans CJK KR"/>
                 <w:b w:val="false"/>
                 <w:bCs w:val="false"/>
               </w:rPr>
@@ -987,6 +1040,7 @@
             </w:pPr>
             <w:r>
               <w:rPr>
+                <w:rFonts w:ascii="Noto Sans CJK KR" w:hAnsi="Noto Sans CJK KR" w:eastAsia="Noto Sans CJK KR" w:cs="Noto Sans CJK KR"/>
                 <w:b w:val="false"/>
                 <w:bCs w:val="false"/>
               </w:rPr>
@@ -1019,6 +1073,7 @@
             </w:pPr>
             <w:r>
               <w:rPr>
+                <w:rFonts w:ascii="Noto Sans CJK KR" w:hAnsi="Noto Sans CJK KR" w:eastAsia="Noto Sans CJK KR" w:cs="Noto Sans CJK KR"/>
                 <w:b w:val="false"/>
                 <w:bCs w:val="false"/>
               </w:rPr>
@@ -1049,6 +1104,7 @@
             </w:pPr>
             <w:r>
               <w:rPr>
+                <w:rFonts w:ascii="Noto Sans CJK KR" w:hAnsi="Noto Sans CJK KR" w:eastAsia="Noto Sans CJK KR" w:cs="Noto Sans CJK KR"/>
                 <w:b w:val="false"/>
                 <w:bCs w:val="false"/>
               </w:rPr>
@@ -1079,6 +1135,7 @@
             </w:pPr>
             <w:r>
               <w:rPr>
+                <w:rFonts w:ascii="Noto Sans CJK KR" w:hAnsi="Noto Sans CJK KR" w:eastAsia="Noto Sans CJK KR" w:cs="Noto Sans CJK KR"/>
                 <w:b w:val="false"/>
                 <w:bCs w:val="false"/>
               </w:rPr>
@@ -1111,6 +1168,7 @@
             </w:pPr>
             <w:r>
               <w:rPr>
+                <w:rFonts w:ascii="Noto Sans CJK KR" w:hAnsi="Noto Sans CJK KR" w:eastAsia="Noto Sans CJK KR" w:cs="Noto Sans CJK KR"/>
                 <w:b w:val="false"/>
                 <w:bCs w:val="false"/>
               </w:rPr>
@@ -1141,6 +1199,7 @@
             </w:pPr>
             <w:r>
               <w:rPr>
+                <w:rFonts w:ascii="Noto Sans CJK KR" w:hAnsi="Noto Sans CJK KR" w:eastAsia="Noto Sans CJK KR" w:cs="Noto Sans CJK KR"/>
                 <w:b w:val="false"/>
                 <w:bCs w:val="false"/>
               </w:rPr>
@@ -1171,6 +1230,7 @@
             </w:pPr>
             <w:r>
               <w:rPr>
+                <w:rFonts w:ascii="Noto Sans CJK KR" w:hAnsi="Noto Sans CJK KR" w:eastAsia="Noto Sans CJK KR" w:cs="Noto Sans CJK KR"/>
                 <w:b w:val="false"/>
                 <w:bCs w:val="false"/>
               </w:rPr>
@@ -1203,6 +1263,7 @@
             </w:pPr>
             <w:r>
               <w:rPr>
+                <w:rFonts w:ascii="Noto Sans CJK KR" w:hAnsi="Noto Sans CJK KR" w:eastAsia="Noto Sans CJK KR" w:cs="Noto Sans CJK KR"/>
                 <w:b w:val="false"/>
                 <w:bCs w:val="false"/>
               </w:rPr>
@@ -1233,6 +1294,7 @@
             </w:pPr>
             <w:r>
               <w:rPr>
+                <w:rFonts w:ascii="Noto Sans CJK KR" w:hAnsi="Noto Sans CJK KR" w:eastAsia="Noto Sans CJK KR" w:cs="Noto Sans CJK KR"/>
                 <w:b w:val="false"/>
                 <w:bCs w:val="false"/>
               </w:rPr>
@@ -1263,6 +1325,7 @@
             </w:pPr>
             <w:r>
               <w:rPr>
+                <w:rFonts w:ascii="Noto Sans CJK KR" w:hAnsi="Noto Sans CJK KR" w:eastAsia="Noto Sans CJK KR" w:cs="Noto Sans CJK KR"/>
                 <w:b w:val="false"/>
                 <w:bCs w:val="false"/>
               </w:rPr>
@@ -1295,6 +1358,7 @@
             </w:pPr>
             <w:r>
               <w:rPr>
+                <w:rFonts w:ascii="Noto Sans CJK KR" w:hAnsi="Noto Sans CJK KR" w:eastAsia="Noto Sans CJK KR" w:cs="Noto Sans CJK KR"/>
                 <w:b w:val="false"/>
                 <w:bCs w:val="false"/>
               </w:rPr>
@@ -1325,6 +1389,7 @@
             </w:pPr>
             <w:r>
               <w:rPr>
+                <w:rFonts w:ascii="Noto Sans CJK KR" w:hAnsi="Noto Sans CJK KR" w:eastAsia="Noto Sans CJK KR" w:cs="Noto Sans CJK KR"/>
                 <w:b w:val="false"/>
                 <w:bCs w:val="false"/>
               </w:rPr>
@@ -1355,6 +1420,7 @@
             </w:pPr>
             <w:r>
               <w:rPr>
+                <w:rFonts w:ascii="Noto Sans CJK KR" w:hAnsi="Noto Sans CJK KR" w:eastAsia="Noto Sans CJK KR" w:cs="Noto Sans CJK KR"/>
                 <w:b w:val="false"/>
                 <w:bCs w:val="false"/>
               </w:rPr>
@@ -1387,6 +1453,7 @@
             </w:pPr>
             <w:r>
               <w:rPr>
+                <w:rFonts w:ascii="Noto Sans CJK KR" w:hAnsi="Noto Sans CJK KR" w:eastAsia="Noto Sans CJK KR" w:cs="Noto Sans CJK KR"/>
                 <w:b w:val="false"/>
                 <w:bCs w:val="false"/>
               </w:rPr>
@@ -1417,6 +1484,7 @@
             </w:pPr>
             <w:r>
               <w:rPr>
+                <w:rFonts w:ascii="Noto Sans CJK KR" w:hAnsi="Noto Sans CJK KR" w:eastAsia="Noto Sans CJK KR" w:cs="Noto Sans CJK KR"/>
                 <w:b w:val="false"/>
                 <w:bCs w:val="false"/>
               </w:rPr>
@@ -1447,6 +1515,7 @@
             </w:pPr>
             <w:r>
               <w:rPr>
+                <w:rFonts w:ascii="Noto Sans CJK KR" w:hAnsi="Noto Sans CJK KR" w:eastAsia="Noto Sans CJK KR" w:cs="Noto Sans CJK KR"/>
                 <w:b w:val="false"/>
                 <w:bCs w:val="false"/>
               </w:rPr>
@@ -1464,6 +1533,9 @@
         </w:pBdr>
       </w:pPr>
       <w:r>
+        <w:rPr>
+          <w:rFonts w:ascii="Noto Sans CJK KR" w:hAnsi="Noto Sans CJK KR" w:eastAsia="Noto Sans CJK KR" w:cs="Noto Sans CJK KR"/>
+        </w:rPr>
         <w:t xml:space="preserve">4. 왜 지식행동사슬인가</w:t>
       </w:r>
     </w:p>
@@ -1474,6 +1546,7 @@
       </w:pPr>
       <w:r>
         <w:rPr>
+          <w:rFonts w:ascii="Noto Sans CJK KR" w:hAnsi="Noto Sans CJK KR" w:eastAsia="Noto Sans CJK KR" w:cs="Noto Sans CJK KR"/>
           <w:b w:val="false"/>
           <w:bCs w:val="false"/>
         </w:rPr>
@@ -1524,6 +1597,7 @@
             </w:pPr>
             <w:r>
               <w:rPr>
+                <w:rFonts w:ascii="Noto Sans CJK KR" w:hAnsi="Noto Sans CJK KR" w:eastAsia="Noto Sans CJK KR" w:cs="Noto Sans CJK KR"/>
                 <w:b/>
                 <w:bCs/>
               </w:rPr>
@@ -1555,6 +1629,7 @@
             </w:pPr>
             <w:r>
               <w:rPr>
+                <w:rFonts w:ascii="Noto Sans CJK KR" w:hAnsi="Noto Sans CJK KR" w:eastAsia="Noto Sans CJK KR" w:cs="Noto Sans CJK KR"/>
                 <w:b/>
                 <w:bCs/>
               </w:rPr>
@@ -1587,6 +1662,7 @@
             </w:pPr>
             <w:r>
               <w:rPr>
+                <w:rFonts w:ascii="Noto Sans CJK KR" w:hAnsi="Noto Sans CJK KR" w:eastAsia="Noto Sans CJK KR" w:cs="Noto Sans CJK KR"/>
                 <w:b w:val="false"/>
                 <w:bCs w:val="false"/>
               </w:rPr>
@@ -1617,6 +1693,7 @@
             </w:pPr>
             <w:r>
               <w:rPr>
+                <w:rFonts w:ascii="Noto Sans CJK KR" w:hAnsi="Noto Sans CJK KR" w:eastAsia="Noto Sans CJK KR" w:cs="Noto Sans CJK KR"/>
                 <w:b w:val="false"/>
                 <w:bCs w:val="false"/>
               </w:rPr>
@@ -1649,6 +1726,7 @@
             </w:pPr>
             <w:r>
               <w:rPr>
+                <w:rFonts w:ascii="Noto Sans CJK KR" w:hAnsi="Noto Sans CJK KR" w:eastAsia="Noto Sans CJK KR" w:cs="Noto Sans CJK KR"/>
                 <w:b w:val="false"/>
                 <w:bCs w:val="false"/>
               </w:rPr>
@@ -1679,6 +1757,7 @@
             </w:pPr>
             <w:r>
               <w:rPr>
+                <w:rFonts w:ascii="Noto Sans CJK KR" w:hAnsi="Noto Sans CJK KR" w:eastAsia="Noto Sans CJK KR" w:cs="Noto Sans CJK KR"/>
                 <w:b w:val="false"/>
                 <w:bCs w:val="false"/>
               </w:rPr>
@@ -1711,6 +1790,7 @@
             </w:pPr>
             <w:r>
               <w:rPr>
+                <w:rFonts w:ascii="Noto Sans CJK KR" w:hAnsi="Noto Sans CJK KR" w:eastAsia="Noto Sans CJK KR" w:cs="Noto Sans CJK KR"/>
                 <w:b w:val="false"/>
                 <w:bCs w:val="false"/>
               </w:rPr>
@@ -1741,6 +1821,7 @@
             </w:pPr>
             <w:r>
               <w:rPr>
+                <w:rFonts w:ascii="Noto Sans CJK KR" w:hAnsi="Noto Sans CJK KR" w:eastAsia="Noto Sans CJK KR" w:cs="Noto Sans CJK KR"/>
                 <w:b w:val="false"/>
                 <w:bCs w:val="false"/>
               </w:rPr>
@@ -1773,6 +1854,7 @@
             </w:pPr>
             <w:r>
               <w:rPr>
+                <w:rFonts w:ascii="Noto Sans CJK KR" w:hAnsi="Noto Sans CJK KR" w:eastAsia="Noto Sans CJK KR" w:cs="Noto Sans CJK KR"/>
                 <w:b w:val="false"/>
                 <w:bCs w:val="false"/>
               </w:rPr>
@@ -1803,6 +1885,7 @@
             </w:pPr>
             <w:r>
               <w:rPr>
+                <w:rFonts w:ascii="Noto Sans CJK KR" w:hAnsi="Noto Sans CJK KR" w:eastAsia="Noto Sans CJK KR" w:cs="Noto Sans CJK KR"/>
                 <w:b w:val="false"/>
                 <w:bCs w:val="false"/>
               </w:rPr>
@@ -1835,6 +1918,7 @@
             </w:pPr>
             <w:r>
               <w:rPr>
+                <w:rFonts w:ascii="Noto Sans CJK KR" w:hAnsi="Noto Sans CJK KR" w:eastAsia="Noto Sans CJK KR" w:cs="Noto Sans CJK KR"/>
                 <w:b w:val="false"/>
                 <w:bCs w:val="false"/>
               </w:rPr>
@@ -1865,6 +1949,7 @@
             </w:pPr>
             <w:r>
               <w:rPr>
+                <w:rFonts w:ascii="Noto Sans CJK KR" w:hAnsi="Noto Sans CJK KR" w:eastAsia="Noto Sans CJK KR" w:cs="Noto Sans CJK KR"/>
                 <w:b w:val="false"/>
                 <w:bCs w:val="false"/>
               </w:rPr>
@@ -1897,6 +1982,7 @@
             </w:pPr>
             <w:r>
               <w:rPr>
+                <w:rFonts w:ascii="Noto Sans CJK KR" w:hAnsi="Noto Sans CJK KR" w:eastAsia="Noto Sans CJK KR" w:cs="Noto Sans CJK KR"/>
                 <w:b w:val="false"/>
                 <w:bCs w:val="false"/>
               </w:rPr>
@@ -1927,6 +2013,7 @@
             </w:pPr>
             <w:r>
               <w:rPr>
+                <w:rFonts w:ascii="Noto Sans CJK KR" w:hAnsi="Noto Sans CJK KR" w:eastAsia="Noto Sans CJK KR" w:cs="Noto Sans CJK KR"/>
                 <w:b w:val="false"/>
                 <w:bCs w:val="false"/>
               </w:rPr>
@@ -1976,6 +2063,7 @@
             </w:pPr>
             <w:r>
               <w:rPr>
+                <w:rFonts w:ascii="Noto Sans CJK KR" w:hAnsi="Noto Sans CJK KR" w:eastAsia="Noto Sans CJK KR" w:cs="Noto Sans CJK KR"/>
                 <w:b/>
                 <w:bCs/>
                 <w:color w:val="1F4E79"/>
@@ -1990,6 +2078,7 @@
             </w:pPr>
             <w:r>
               <w:rPr>
+                <w:rFonts w:ascii="Noto Sans CJK KR" w:hAnsi="Noto Sans CJK KR" w:eastAsia="Noto Sans CJK KR" w:cs="Noto Sans CJK KR"/>
                 <w:b/>
                 <w:bCs/>
               </w:rPr>
@@ -2003,6 +2092,7 @@
             </w:pPr>
             <w:r>
               <w:rPr>
+                <w:rFonts w:ascii="Noto Sans CJK KR" w:hAnsi="Noto Sans CJK KR" w:eastAsia="Noto Sans CJK KR" w:cs="Noto Sans CJK KR"/>
                 <w:b/>
                 <w:bCs/>
               </w:rPr>
@@ -2016,6 +2106,7 @@
             </w:pPr>
             <w:r>
               <w:rPr>
+                <w:rFonts w:ascii="Noto Sans CJK KR" w:hAnsi="Noto Sans CJK KR" w:eastAsia="Noto Sans CJK KR" w:cs="Noto Sans CJK KR"/>
                 <w:b/>
                 <w:bCs/>
               </w:rPr>
@@ -2033,6 +2124,9 @@
         </w:pBdr>
       </w:pPr>
       <w:r>
+        <w:rPr>
+          <w:rFonts w:ascii="Noto Sans CJK KR" w:hAnsi="Noto Sans CJK KR" w:eastAsia="Noto Sans CJK KR" w:cs="Noto Sans CJK KR"/>
+        </w:rPr>
         <w:t xml:space="preserve">5. 실제 동작 구조</w:t>
       </w:r>
     </w:p>
@@ -2046,6 +2140,9 @@
         <w:spacing w:after="60"/>
       </w:pPr>
       <w:r>
+        <w:rPr>
+          <w:rFonts w:ascii="Noto Sans CJK KR" w:hAnsi="Noto Sans CJK KR" w:eastAsia="Noto Sans CJK KR" w:cs="Noto Sans CJK KR"/>
+        </w:rPr>
         <w:t xml:space="preserve">사용자 진술만 구조화 입력으로 변환하고 누락·충돌을 검사한다.</w:t>
       </w:r>
     </w:p>
@@ -2059,6 +2156,9 @@
         <w:spacing w:after="60"/>
       </w:pPr>
       <w:r>
+        <w:rPr>
+          <w:rFonts w:ascii="Noto Sans CJK KR" w:hAnsi="Noto Sans CJK KR" w:eastAsia="Noto Sans CJK KR" w:cs="Noto Sans CJK KR"/>
+        </w:rPr>
         <w:t xml:space="preserve">Runtime Composite 단일 진입점에서 질문 라우터를 정확히 한 번 실행한다.</w:t>
       </w:r>
     </w:p>
@@ -2072,6 +2172,9 @@
         <w:spacing w:after="60"/>
       </w:pPr>
       <w:r>
+        <w:rPr>
+          <w:rFonts w:ascii="Noto Sans CJK KR" w:hAnsi="Noto Sans CJK KR" w:eastAsia="Noto Sans CJK KR" w:cs="Noto Sans CJK KR"/>
+        </w:rPr>
         <w:t xml:space="preserve">관련 Identity의 Goal·Task·Knowledge·Method·Skill 파일을 선택하고 SHA-256을 확인한다.</w:t>
       </w:r>
     </w:p>
@@ -2085,6 +2188,9 @@
         <w:spacing w:after="60"/>
       </w:pPr>
       <w:r>
+        <w:rPr>
+          <w:rFonts w:ascii="Noto Sans CJK KR" w:hAnsi="Noto Sans CJK KR" w:eastAsia="Noto Sans CJK KR" w:cs="Noto Sans CJK KR"/>
+        </w:rPr>
         <w:t xml:space="preserve">필요한 도메인 Run Skill을 최대 한 번 실행해 PROCEED·REVIEW·STOP과 산출물을 만든다.</w:t>
       </w:r>
     </w:p>
@@ -2098,7 +2204,10 @@
         <w:spacing w:after="60"/>
       </w:pPr>
       <w:r>
-        <w:t xml:space="preserve">로컬 AI가 검증된 결과만 자연스러운 한국어로 표현한다.</w:t>
+        <w:rPr>
+          <w:rFonts w:ascii="Noto Sans CJK KR" w:hAnsi="Noto Sans CJK KR" w:eastAsia="Noto Sans CJK KR" w:cs="Noto Sans CJK KR"/>
+        </w:rPr>
+        <w:t xml:space="preserve">로컬·서버 AI가 검증된 결과만 자연스러운 한국어로 표현한다.</w:t>
       </w:r>
     </w:p>
     <w:p>
@@ -2111,6 +2220,9 @@
         <w:spacing w:after="60"/>
       </w:pPr>
       <w:r>
+        <w:rPr>
+          <w:rFonts w:ascii="Noto Sans CJK KR" w:hAnsi="Noto Sans CJK KR" w:eastAsia="Noto Sans CJK KR" w:cs="Noto Sans CJK KR"/>
+        </w:rPr>
         <w:t xml:space="preserve">Output Risk Gate가 판정·주장·권한·외부링크를 재검사한다.</w:t>
       </w:r>
     </w:p>
@@ -2124,6 +2236,9 @@
         <w:spacing w:after="60"/>
       </w:pPr>
       <w:r>
+        <w:rPr>
+          <w:rFonts w:ascii="Noto Sans CJK KR" w:hAnsi="Noto Sans CJK KR" w:eastAsia="Noto Sans CJK KR" w:cs="Noto Sans CJK KR"/>
+        </w:rPr>
         <w:t xml:space="preserve">Context·KAC·Skill·산출물·해시를 Run Record로 저장한다.</w:t>
       </w:r>
     </w:p>
@@ -2167,6 +2282,7 @@
             </w:pPr>
             <w:r>
               <w:rPr>
+                <w:rFonts w:ascii="Noto Sans CJK KR" w:hAnsi="Noto Sans CJK KR" w:eastAsia="Noto Sans CJK KR" w:cs="Noto Sans CJK KR"/>
                 <w:b/>
                 <w:bCs/>
                 <w:color w:val="1F4E79"/>
@@ -2181,6 +2297,7 @@
             </w:pPr>
             <w:r>
               <w:rPr>
+                <w:rFonts w:ascii="Noto Sans CJK KR" w:hAnsi="Noto Sans CJK KR" w:eastAsia="Noto Sans CJK KR" w:cs="Noto Sans CJK KR"/>
                 <w:b/>
                 <w:bCs/>
               </w:rPr>
@@ -2194,6 +2311,7 @@
             </w:pPr>
             <w:r>
               <w:rPr>
+                <w:rFonts w:ascii="Noto Sans CJK KR" w:hAnsi="Noto Sans CJK KR" w:eastAsia="Noto Sans CJK KR" w:cs="Noto Sans CJK KR"/>
                 <w:b/>
                 <w:bCs/>
               </w:rPr>
@@ -2211,6 +2329,9 @@
         </w:pBdr>
       </w:pPr>
       <w:r>
+        <w:rPr>
+          <w:rFonts w:ascii="Noto Sans CJK KR" w:hAnsi="Noto Sans CJK KR" w:eastAsia="Noto Sans CJK KR" w:cs="Noto Sans CJK KR"/>
+        </w:rPr>
         <w:t xml:space="preserve">6. 구현된 질문 경로</w:t>
       </w:r>
     </w:p>
@@ -2258,6 +2379,7 @@
             </w:pPr>
             <w:r>
               <w:rPr>
+                <w:rFonts w:ascii="Noto Sans CJK KR" w:hAnsi="Noto Sans CJK KR" w:eastAsia="Noto Sans CJK KR" w:cs="Noto Sans CJK KR"/>
                 <w:b/>
                 <w:bCs/>
               </w:rPr>
@@ -2289,6 +2411,7 @@
             </w:pPr>
             <w:r>
               <w:rPr>
+                <w:rFonts w:ascii="Noto Sans CJK KR" w:hAnsi="Noto Sans CJK KR" w:eastAsia="Noto Sans CJK KR" w:cs="Noto Sans CJK KR"/>
                 <w:b/>
                 <w:bCs/>
               </w:rPr>
@@ -2321,6 +2444,7 @@
             </w:pPr>
             <w:r>
               <w:rPr>
+                <w:rFonts w:ascii="Noto Sans CJK KR" w:hAnsi="Noto Sans CJK KR" w:eastAsia="Noto Sans CJK KR" w:cs="Noto Sans CJK KR"/>
                 <w:b w:val="false"/>
                 <w:bCs w:val="false"/>
               </w:rPr>
@@ -2351,6 +2475,7 @@
             </w:pPr>
             <w:r>
               <w:rPr>
+                <w:rFonts w:ascii="Noto Sans CJK KR" w:hAnsi="Noto Sans CJK KR" w:eastAsia="Noto Sans CJK KR" w:cs="Noto Sans CJK KR"/>
                 <w:b w:val="false"/>
                 <w:bCs w:val="false"/>
               </w:rPr>
@@ -2383,6 +2508,7 @@
             </w:pPr>
             <w:r>
               <w:rPr>
+                <w:rFonts w:ascii="Noto Sans CJK KR" w:hAnsi="Noto Sans CJK KR" w:eastAsia="Noto Sans CJK KR" w:cs="Noto Sans CJK KR"/>
                 <w:b w:val="false"/>
                 <w:bCs w:val="false"/>
               </w:rPr>
@@ -2413,6 +2539,7 @@
             </w:pPr>
             <w:r>
               <w:rPr>
+                <w:rFonts w:ascii="Noto Sans CJK KR" w:hAnsi="Noto Sans CJK KR" w:eastAsia="Noto Sans CJK KR" w:cs="Noto Sans CJK KR"/>
                 <w:b w:val="false"/>
                 <w:bCs w:val="false"/>
               </w:rPr>
@@ -2445,6 +2572,7 @@
             </w:pPr>
             <w:r>
               <w:rPr>
+                <w:rFonts w:ascii="Noto Sans CJK KR" w:hAnsi="Noto Sans CJK KR" w:eastAsia="Noto Sans CJK KR" w:cs="Noto Sans CJK KR"/>
                 <w:b w:val="false"/>
                 <w:bCs w:val="false"/>
               </w:rPr>
@@ -2475,6 +2603,7 @@
             </w:pPr>
             <w:r>
               <w:rPr>
+                <w:rFonts w:ascii="Noto Sans CJK KR" w:hAnsi="Noto Sans CJK KR" w:eastAsia="Noto Sans CJK KR" w:cs="Noto Sans CJK KR"/>
                 <w:b w:val="false"/>
                 <w:bCs w:val="false"/>
               </w:rPr>
@@ -2507,6 +2636,7 @@
             </w:pPr>
             <w:r>
               <w:rPr>
+                <w:rFonts w:ascii="Noto Sans CJK KR" w:hAnsi="Noto Sans CJK KR" w:eastAsia="Noto Sans CJK KR" w:cs="Noto Sans CJK KR"/>
                 <w:b w:val="false"/>
                 <w:bCs w:val="false"/>
               </w:rPr>
@@ -2537,6 +2667,7 @@
             </w:pPr>
             <w:r>
               <w:rPr>
+                <w:rFonts w:ascii="Noto Sans CJK KR" w:hAnsi="Noto Sans CJK KR" w:eastAsia="Noto Sans CJK KR" w:cs="Noto Sans CJK KR"/>
                 <w:b w:val="false"/>
                 <w:bCs w:val="false"/>
               </w:rPr>
@@ -2569,6 +2700,7 @@
             </w:pPr>
             <w:r>
               <w:rPr>
+                <w:rFonts w:ascii="Noto Sans CJK KR" w:hAnsi="Noto Sans CJK KR" w:eastAsia="Noto Sans CJK KR" w:cs="Noto Sans CJK KR"/>
                 <w:b w:val="false"/>
                 <w:bCs w:val="false"/>
               </w:rPr>
@@ -2599,6 +2731,7 @@
             </w:pPr>
             <w:r>
               <w:rPr>
+                <w:rFonts w:ascii="Noto Sans CJK KR" w:hAnsi="Noto Sans CJK KR" w:eastAsia="Noto Sans CJK KR" w:cs="Noto Sans CJK KR"/>
                 <w:b w:val="false"/>
                 <w:bCs w:val="false"/>
               </w:rPr>
@@ -2631,6 +2764,7 @@
             </w:pPr>
             <w:r>
               <w:rPr>
+                <w:rFonts w:ascii="Noto Sans CJK KR" w:hAnsi="Noto Sans CJK KR" w:eastAsia="Noto Sans CJK KR" w:cs="Noto Sans CJK KR"/>
                 <w:b w:val="false"/>
                 <w:bCs w:val="false"/>
               </w:rPr>
@@ -2661,6 +2795,7 @@
             </w:pPr>
             <w:r>
               <w:rPr>
+                <w:rFonts w:ascii="Noto Sans CJK KR" w:hAnsi="Noto Sans CJK KR" w:eastAsia="Noto Sans CJK KR" w:cs="Noto Sans CJK KR"/>
                 <w:b w:val="false"/>
                 <w:bCs w:val="false"/>
               </w:rPr>
@@ -2693,6 +2828,7 @@
             </w:pPr>
             <w:r>
               <w:rPr>
+                <w:rFonts w:ascii="Noto Sans CJK KR" w:hAnsi="Noto Sans CJK KR" w:eastAsia="Noto Sans CJK KR" w:cs="Noto Sans CJK KR"/>
                 <w:b w:val="false"/>
                 <w:bCs w:val="false"/>
               </w:rPr>
@@ -2723,6 +2859,7 @@
             </w:pPr>
             <w:r>
               <w:rPr>
+                <w:rFonts w:ascii="Noto Sans CJK KR" w:hAnsi="Noto Sans CJK KR" w:eastAsia="Noto Sans CJK KR" w:cs="Noto Sans CJK KR"/>
                 <w:b w:val="false"/>
                 <w:bCs w:val="false"/>
               </w:rPr>
@@ -2755,6 +2892,7 @@
             </w:pPr>
             <w:r>
               <w:rPr>
+                <w:rFonts w:ascii="Noto Sans CJK KR" w:hAnsi="Noto Sans CJK KR" w:eastAsia="Noto Sans CJK KR" w:cs="Noto Sans CJK KR"/>
                 <w:b w:val="false"/>
                 <w:bCs w:val="false"/>
               </w:rPr>
@@ -2785,6 +2923,7 @@
             </w:pPr>
             <w:r>
               <w:rPr>
+                <w:rFonts w:ascii="Noto Sans CJK KR" w:hAnsi="Noto Sans CJK KR" w:eastAsia="Noto Sans CJK KR" w:cs="Noto Sans CJK KR"/>
                 <w:b w:val="false"/>
                 <w:bCs w:val="false"/>
               </w:rPr>
@@ -2817,6 +2956,7 @@
             </w:pPr>
             <w:r>
               <w:rPr>
+                <w:rFonts w:ascii="Noto Sans CJK KR" w:hAnsi="Noto Sans CJK KR" w:eastAsia="Noto Sans CJK KR" w:cs="Noto Sans CJK KR"/>
                 <w:b w:val="false"/>
                 <w:bCs w:val="false"/>
               </w:rPr>
@@ -2847,6 +2987,7 @@
             </w:pPr>
             <w:r>
               <w:rPr>
+                <w:rFonts w:ascii="Noto Sans CJK KR" w:hAnsi="Noto Sans CJK KR" w:eastAsia="Noto Sans CJK KR" w:cs="Noto Sans CJK KR"/>
                 <w:b w:val="false"/>
                 <w:bCs w:val="false"/>
               </w:rPr>
@@ -2864,6 +3005,9 @@
         </w:pBdr>
       </w:pPr>
       <w:r>
+        <w:rPr>
+          <w:rFonts w:ascii="Noto Sans CJK KR" w:hAnsi="Noto Sans CJK KR" w:eastAsia="Noto Sans CJK KR" w:cs="Noto Sans CJK KR"/>
+        </w:rPr>
         <w:t xml:space="preserve">7. 대표 시연</w:t>
       </w:r>
     </w:p>
@@ -2872,6 +3016,9 @@
         <w:pStyle w:val="Heading2"/>
       </w:pPr>
       <w:r>
+        <w:rPr>
+          <w:rFonts w:ascii="Noto Sans CJK KR" w:hAnsi="Noto Sans CJK KR" w:eastAsia="Noto Sans CJK KR" w:cs="Noto Sans CJK KR"/>
+        </w:rPr>
         <w:t xml:space="preserve">7.1 일반 ESG 질문</w:t>
       </w:r>
     </w:p>
@@ -2882,6 +3029,7 @@
       </w:pPr>
       <w:r>
         <w:rPr>
+          <w:rFonts w:ascii="Noto Sans CJK KR" w:hAnsi="Noto Sans CJK KR" w:eastAsia="Noto Sans CJK KR" w:cs="Noto Sans CJK KR"/>
           <w:b w:val="false"/>
           <w:bCs w:val="false"/>
         </w:rPr>
@@ -2893,6 +3041,9 @@
         <w:pStyle w:val="Heading2"/>
       </w:pPr>
       <w:r>
+        <w:rPr>
+          <w:rFonts w:ascii="Noto Sans CJK KR" w:hAnsi="Noto Sans CJK KR" w:eastAsia="Noto Sans CJK KR" w:cs="Noto Sans CJK KR"/>
+        </w:rPr>
         <w:t xml:space="preserve">7.2 구체적인 Scope 질문</w:t>
       </w:r>
     </w:p>
@@ -2903,6 +3054,7 @@
       </w:pPr>
       <w:r>
         <w:rPr>
+          <w:rFonts w:ascii="Noto Sans CJK KR" w:hAnsi="Noto Sans CJK KR" w:eastAsia="Noto Sans CJK KR" w:cs="Noto Sans CJK KR"/>
           <w:b w:val="false"/>
           <w:bCs w:val="false"/>
         </w:rPr>
@@ -2914,6 +3066,9 @@
         <w:pStyle w:val="Heading2"/>
       </w:pPr>
       <w:r>
+        <w:rPr>
+          <w:rFonts w:ascii="Noto Sans CJK KR" w:hAnsi="Noto Sans CJK KR" w:eastAsia="Noto Sans CJK KR" w:cs="Noto Sans CJK KR"/>
+        </w:rPr>
         <w:t xml:space="preserve">7.3 상충 입력</w:t>
       </w:r>
     </w:p>
@@ -2924,10 +3079,11 @@
       </w:pPr>
       <w:r>
         <w:rPr>
+          <w:rFonts w:ascii="Noto Sans CJK KR" w:hAnsi="Noto Sans CJK KR" w:eastAsia="Noto Sans CJK KR" w:cs="Noto Sans CJK KR"/>
           <w:b w:val="false"/>
           <w:bCs w:val="false"/>
         </w:rPr>
-        <w:t xml:space="preserve">회사 소유 보일러와 구매전력을 한 질문에 섞으면 하나의 Scope를 임의 선택하지 않는다. REVIEW로 멈추고 두 활동 중 하나를 먼저 선택해 달라는 후속 질문을 표시하며 로컬 AI 자유 생성을 차단한다.</w:t>
+        <w:t xml:space="preserve">회사 소유 보일러와 구매전력을 한 질문에 섞으면 하나의 Scope를 임의 선택하지 않는다. REVIEW로 멈추고 두 활동 중 하나를 먼저 선택해 달라는 후속 질문을 표시하며 생성형 AI 자유 생성을 차단한다.</w:t>
       </w:r>
     </w:p>
     <w:p>
@@ -2935,6 +3091,9 @@
         <w:pStyle w:val="Heading2"/>
       </w:pPr>
       <w:r>
+        <w:rPr>
+          <w:rFonts w:ascii="Noto Sans CJK KR" w:hAnsi="Noto Sans CJK KR" w:eastAsia="Noto Sans CJK KR" w:cs="Noto Sans CJK KR"/>
+        </w:rPr>
         <w:t xml:space="preserve">7.4 명시적 구매처 질문</w:t>
       </w:r>
     </w:p>
@@ -2945,6 +3104,7 @@
       </w:pPr>
       <w:r>
         <w:rPr>
+          <w:rFonts w:ascii="Noto Sans CJK KR" w:hAnsi="Noto Sans CJK KR" w:eastAsia="Noto Sans CJK KR" w:cs="Noto Sans CJK KR"/>
           <w:b w:val="false"/>
           <w:bCs w:val="false"/>
         </w:rPr>
@@ -2959,6 +3119,9 @@
         </w:pBdr>
       </w:pPr>
       <w:r>
+        <w:rPr>
+          <w:rFonts w:ascii="Noto Sans CJK KR" w:hAnsi="Noto Sans CJK KR" w:eastAsia="Noto Sans CJK KR" w:cs="Noto Sans CJK KR"/>
+        </w:rPr>
         <w:t xml:space="preserve">8. AI·데이터 역할과 책임성</w:t>
       </w:r>
     </w:p>
@@ -3007,6 +3170,7 @@
             </w:pPr>
             <w:r>
               <w:rPr>
+                <w:rFonts w:ascii="Noto Sans CJK KR" w:hAnsi="Noto Sans CJK KR" w:eastAsia="Noto Sans CJK KR" w:cs="Noto Sans CJK KR"/>
                 <w:b/>
                 <w:bCs/>
               </w:rPr>
@@ -3038,6 +3202,7 @@
             </w:pPr>
             <w:r>
               <w:rPr>
+                <w:rFonts w:ascii="Noto Sans CJK KR" w:hAnsi="Noto Sans CJK KR" w:eastAsia="Noto Sans CJK KR" w:cs="Noto Sans CJK KR"/>
                 <w:b/>
                 <w:bCs/>
               </w:rPr>
@@ -3069,6 +3234,7 @@
             </w:pPr>
             <w:r>
               <w:rPr>
+                <w:rFonts w:ascii="Noto Sans CJK KR" w:hAnsi="Noto Sans CJK KR" w:eastAsia="Noto Sans CJK KR" w:cs="Noto Sans CJK KR"/>
                 <w:b/>
                 <w:bCs/>
               </w:rPr>
@@ -3101,6 +3267,7 @@
             </w:pPr>
             <w:r>
               <w:rPr>
+                <w:rFonts w:ascii="Noto Sans CJK KR" w:hAnsi="Noto Sans CJK KR" w:eastAsia="Noto Sans CJK KR" w:cs="Noto Sans CJK KR"/>
                 <w:b w:val="false"/>
                 <w:bCs w:val="false"/>
               </w:rPr>
@@ -3131,6 +3298,7 @@
             </w:pPr>
             <w:r>
               <w:rPr>
+                <w:rFonts w:ascii="Noto Sans CJK KR" w:hAnsi="Noto Sans CJK KR" w:eastAsia="Noto Sans CJK KR" w:cs="Noto Sans CJK KR"/>
                 <w:b w:val="false"/>
                 <w:bCs w:val="false"/>
               </w:rPr>
@@ -3161,6 +3329,7 @@
             </w:pPr>
             <w:r>
               <w:rPr>
+                <w:rFonts w:ascii="Noto Sans CJK KR" w:hAnsi="Noto Sans CJK KR" w:eastAsia="Noto Sans CJK KR" w:cs="Noto Sans CJK KR"/>
                 <w:b w:val="false"/>
                 <w:bCs w:val="false"/>
               </w:rPr>
@@ -3193,6 +3362,7 @@
             </w:pPr>
             <w:r>
               <w:rPr>
+                <w:rFonts w:ascii="Noto Sans CJK KR" w:hAnsi="Noto Sans CJK KR" w:eastAsia="Noto Sans CJK KR" w:cs="Noto Sans CJK KR"/>
                 <w:b w:val="false"/>
                 <w:bCs w:val="false"/>
               </w:rPr>
@@ -3223,6 +3393,7 @@
             </w:pPr>
             <w:r>
               <w:rPr>
+                <w:rFonts w:ascii="Noto Sans CJK KR" w:hAnsi="Noto Sans CJK KR" w:eastAsia="Noto Sans CJK KR" w:cs="Noto Sans CJK KR"/>
                 <w:b w:val="false"/>
                 <w:bCs w:val="false"/>
               </w:rPr>
@@ -3253,6 +3424,7 @@
             </w:pPr>
             <w:r>
               <w:rPr>
+                <w:rFonts w:ascii="Noto Sans CJK KR" w:hAnsi="Noto Sans CJK KR" w:eastAsia="Noto Sans CJK KR" w:cs="Noto Sans CJK KR"/>
                 <w:b w:val="false"/>
                 <w:bCs w:val="false"/>
               </w:rPr>
@@ -3285,6 +3457,7 @@
             </w:pPr>
             <w:r>
               <w:rPr>
+                <w:rFonts w:ascii="Noto Sans CJK KR" w:hAnsi="Noto Sans CJK KR" w:eastAsia="Noto Sans CJK KR" w:cs="Noto Sans CJK KR"/>
                 <w:b w:val="false"/>
                 <w:bCs w:val="false"/>
               </w:rPr>
@@ -3315,6 +3488,7 @@
             </w:pPr>
             <w:r>
               <w:rPr>
+                <w:rFonts w:ascii="Noto Sans CJK KR" w:hAnsi="Noto Sans CJK KR" w:eastAsia="Noto Sans CJK KR" w:cs="Noto Sans CJK KR"/>
                 <w:b w:val="false"/>
                 <w:bCs w:val="false"/>
               </w:rPr>
@@ -3345,6 +3519,7 @@
             </w:pPr>
             <w:r>
               <w:rPr>
+                <w:rFonts w:ascii="Noto Sans CJK KR" w:hAnsi="Noto Sans CJK KR" w:eastAsia="Noto Sans CJK KR" w:cs="Noto Sans CJK KR"/>
                 <w:b w:val="false"/>
                 <w:bCs w:val="false"/>
               </w:rPr>
@@ -3377,10 +3552,11 @@
             </w:pPr>
             <w:r>
               <w:rPr>
-                <w:b w:val="false"/>
-                <w:bCs w:val="false"/>
-              </w:rPr>
-              <w:t xml:space="preserve">로컬 AI</w:t>
+                <w:rFonts w:ascii="Noto Sans CJK KR" w:hAnsi="Noto Sans CJK KR" w:eastAsia="Noto Sans CJK KR" w:cs="Noto Sans CJK KR"/>
+                <w:b w:val="false"/>
+                <w:bCs w:val="false"/>
+              </w:rPr>
+              <w:t xml:space="preserve">로컬·서버 AI</w:t>
             </w:r>
           </w:p>
         </w:tc>
@@ -3407,6 +3583,7 @@
             </w:pPr>
             <w:r>
               <w:rPr>
+                <w:rFonts w:ascii="Noto Sans CJK KR" w:hAnsi="Noto Sans CJK KR" w:eastAsia="Noto Sans CJK KR" w:cs="Noto Sans CJK KR"/>
                 <w:b w:val="false"/>
                 <w:bCs w:val="false"/>
               </w:rPr>
@@ -3437,6 +3614,7 @@
             </w:pPr>
             <w:r>
               <w:rPr>
+                <w:rFonts w:ascii="Noto Sans CJK KR" w:hAnsi="Noto Sans CJK KR" w:eastAsia="Noto Sans CJK KR" w:cs="Noto Sans CJK KR"/>
                 <w:b w:val="false"/>
                 <w:bCs w:val="false"/>
               </w:rPr>
@@ -3469,6 +3647,7 @@
             </w:pPr>
             <w:r>
               <w:rPr>
+                <w:rFonts w:ascii="Noto Sans CJK KR" w:hAnsi="Noto Sans CJK KR" w:eastAsia="Noto Sans CJK KR" w:cs="Noto Sans CJK KR"/>
                 <w:b w:val="false"/>
                 <w:bCs w:val="false"/>
               </w:rPr>
@@ -3499,6 +3678,7 @@
             </w:pPr>
             <w:r>
               <w:rPr>
+                <w:rFonts w:ascii="Noto Sans CJK KR" w:hAnsi="Noto Sans CJK KR" w:eastAsia="Noto Sans CJK KR" w:cs="Noto Sans CJK KR"/>
                 <w:b w:val="false"/>
                 <w:bCs w:val="false"/>
               </w:rPr>
@@ -3529,6 +3709,7 @@
             </w:pPr>
             <w:r>
               <w:rPr>
+                <w:rFonts w:ascii="Noto Sans CJK KR" w:hAnsi="Noto Sans CJK KR" w:eastAsia="Noto Sans CJK KR" w:cs="Noto Sans CJK KR"/>
                 <w:b w:val="false"/>
                 <w:bCs w:val="false"/>
               </w:rPr>
@@ -3561,6 +3742,7 @@
             </w:pPr>
             <w:r>
               <w:rPr>
+                <w:rFonts w:ascii="Noto Sans CJK KR" w:hAnsi="Noto Sans CJK KR" w:eastAsia="Noto Sans CJK KR" w:cs="Noto Sans CJK KR"/>
                 <w:b w:val="false"/>
                 <w:bCs w:val="false"/>
               </w:rPr>
@@ -3591,6 +3773,7 @@
             </w:pPr>
             <w:r>
               <w:rPr>
+                <w:rFonts w:ascii="Noto Sans CJK KR" w:hAnsi="Noto Sans CJK KR" w:eastAsia="Noto Sans CJK KR" w:cs="Noto Sans CJK KR"/>
                 <w:b w:val="false"/>
                 <w:bCs w:val="false"/>
               </w:rPr>
@@ -3621,6 +3804,7 @@
             </w:pPr>
             <w:r>
               <w:rPr>
+                <w:rFonts w:ascii="Noto Sans CJK KR" w:hAnsi="Noto Sans CJK KR" w:eastAsia="Noto Sans CJK KR" w:cs="Noto Sans CJK KR"/>
                 <w:b w:val="false"/>
                 <w:bCs w:val="false"/>
               </w:rPr>
@@ -3637,6 +3821,7 @@
       </w:pPr>
       <w:r>
         <w:rPr>
+          <w:rFonts w:ascii="Noto Sans CJK KR" w:hAnsi="Noto Sans CJK KR" w:eastAsia="Noto Sans CJK KR" w:cs="Noto Sans CJK KR"/>
           <w:b w:val="false"/>
           <w:bCs w:val="false"/>
         </w:rPr>
@@ -3651,6 +3836,9 @@
         </w:pBdr>
       </w:pPr>
       <w:r>
+        <w:rPr>
+          <w:rFonts w:ascii="Noto Sans CJK KR" w:hAnsi="Noto Sans CJK KR" w:eastAsia="Noto Sans CJK KR" w:cs="Noto Sans CJK KR"/>
+        </w:rPr>
         <w:t xml:space="preserve">9. 현재 MVP 검증 결과</w:t>
       </w:r>
     </w:p>
@@ -3698,6 +3886,7 @@
             </w:pPr>
             <w:r>
               <w:rPr>
+                <w:rFonts w:ascii="Noto Sans CJK KR" w:hAnsi="Noto Sans CJK KR" w:eastAsia="Noto Sans CJK KR" w:cs="Noto Sans CJK KR"/>
                 <w:b/>
                 <w:bCs/>
               </w:rPr>
@@ -3729,6 +3918,7 @@
             </w:pPr>
             <w:r>
               <w:rPr>
+                <w:rFonts w:ascii="Noto Sans CJK KR" w:hAnsi="Noto Sans CJK KR" w:eastAsia="Noto Sans CJK KR" w:cs="Noto Sans CJK KR"/>
                 <w:b/>
                 <w:bCs/>
               </w:rPr>
@@ -3761,6 +3951,7 @@
             </w:pPr>
             <w:r>
               <w:rPr>
+                <w:rFonts w:ascii="Noto Sans CJK KR" w:hAnsi="Noto Sans CJK KR" w:eastAsia="Noto Sans CJK KR" w:cs="Noto Sans CJK KR"/>
                 <w:b w:val="false"/>
                 <w:bCs w:val="false"/>
               </w:rPr>
@@ -3791,10 +3982,11 @@
             </w:pPr>
             <w:r>
               <w:rPr>
-                <w:b w:val="false"/>
-                <w:bCs w:val="false"/>
-              </w:rPr>
-              <w:t xml:space="preserve">35건 PASS(Web 27·Composite 3·원자 Skill 5)</w:t>
+                <w:rFonts w:ascii="Noto Sans CJK KR" w:hAnsi="Noto Sans CJK KR" w:eastAsia="Noto Sans CJK KR" w:cs="Noto Sans CJK KR"/>
+                <w:b w:val="false"/>
+                <w:bCs w:val="false"/>
+              </w:rPr>
+              <w:t xml:space="preserve">36건 PASS(Web 28·Composite 3·원자 Skill 5)</w:t>
             </w:r>
           </w:p>
         </w:tc>
@@ -3823,6 +4015,7 @@
             </w:pPr>
             <w:r>
               <w:rPr>
+                <w:rFonts w:ascii="Noto Sans CJK KR" w:hAnsi="Noto Sans CJK KR" w:eastAsia="Noto Sans CJK KR" w:cs="Noto Sans CJK KR"/>
                 <w:b w:val="false"/>
                 <w:bCs w:val="false"/>
               </w:rPr>
@@ -3853,10 +4046,11 @@
             </w:pPr>
             <w:r>
               <w:rPr>
-                <w:b w:val="false"/>
-                <w:bCs w:val="false"/>
-              </w:rPr>
-              <w:t xml:space="preserve">63건 PASS</w:t>
+                <w:rFonts w:ascii="Noto Sans CJK KR" w:hAnsi="Noto Sans CJK KR" w:eastAsia="Noto Sans CJK KR" w:cs="Noto Sans CJK KR"/>
+                <w:b w:val="false"/>
+                <w:bCs w:val="false"/>
+              </w:rPr>
+              <w:t xml:space="preserve">64건 PASS</w:t>
             </w:r>
           </w:p>
         </w:tc>
@@ -3885,6 +4079,7 @@
             </w:pPr>
             <w:r>
               <w:rPr>
+                <w:rFonts w:ascii="Noto Sans CJK KR" w:hAnsi="Noto Sans CJK KR" w:eastAsia="Noto Sans CJK KR" w:cs="Noto Sans CJK KR"/>
                 <w:b w:val="false"/>
                 <w:bCs w:val="false"/>
               </w:rPr>
@@ -3915,6 +4110,7 @@
             </w:pPr>
             <w:r>
               <w:rPr>
+                <w:rFonts w:ascii="Noto Sans CJK KR" w:hAnsi="Noto Sans CJK KR" w:eastAsia="Noto Sans CJK KR" w:cs="Noto Sans CJK KR"/>
                 <w:b w:val="false"/>
                 <w:bCs w:val="false"/>
               </w:rPr>
@@ -3947,6 +4143,7 @@
             </w:pPr>
             <w:r>
               <w:rPr>
+                <w:rFonts w:ascii="Noto Sans CJK KR" w:hAnsi="Noto Sans CJK KR" w:eastAsia="Noto Sans CJK KR" w:cs="Noto Sans CJK KR"/>
                 <w:b w:val="false"/>
                 <w:bCs w:val="false"/>
               </w:rPr>
@@ -3977,6 +4174,7 @@
             </w:pPr>
             <w:r>
               <w:rPr>
+                <w:rFonts w:ascii="Noto Sans CJK KR" w:hAnsi="Noto Sans CJK KR" w:eastAsia="Noto Sans CJK KR" w:cs="Noto Sans CJK KR"/>
                 <w:b w:val="false"/>
                 <w:bCs w:val="false"/>
               </w:rPr>
@@ -4009,6 +4207,7 @@
             </w:pPr>
             <w:r>
               <w:rPr>
+                <w:rFonts w:ascii="Noto Sans CJK KR" w:hAnsi="Noto Sans CJK KR" w:eastAsia="Noto Sans CJK KR" w:cs="Noto Sans CJK KR"/>
                 <w:b w:val="false"/>
                 <w:bCs w:val="false"/>
               </w:rPr>
@@ -4039,6 +4238,7 @@
             </w:pPr>
             <w:r>
               <w:rPr>
+                <w:rFonts w:ascii="Noto Sans CJK KR" w:hAnsi="Noto Sans CJK KR" w:eastAsia="Noto Sans CJK KR" w:cs="Noto Sans CJK KR"/>
                 <w:b w:val="false"/>
                 <w:bCs w:val="false"/>
               </w:rPr>
@@ -4071,6 +4271,7 @@
             </w:pPr>
             <w:r>
               <w:rPr>
+                <w:rFonts w:ascii="Noto Sans CJK KR" w:hAnsi="Noto Sans CJK KR" w:eastAsia="Noto Sans CJK KR" w:cs="Noto Sans CJK KR"/>
                 <w:b w:val="false"/>
                 <w:bCs w:val="false"/>
               </w:rPr>
@@ -4101,10 +4302,11 @@
             </w:pPr>
             <w:r>
               <w:rPr>
-                <w:b w:val="false"/>
-                <w:bCs w:val="false"/>
-              </w:rPr>
-              <w:t xml:space="preserve">63건 전부 확인</w:t>
+                <w:rFonts w:ascii="Noto Sans CJK KR" w:hAnsi="Noto Sans CJK KR" w:eastAsia="Noto Sans CJK KR" w:cs="Noto Sans CJK KR"/>
+                <w:b w:val="false"/>
+                <w:bCs w:val="false"/>
+              </w:rPr>
+              <w:t xml:space="preserve">64건 전부 확인</w:t>
             </w:r>
           </w:p>
         </w:tc>
@@ -4133,6 +4335,7 @@
             </w:pPr>
             <w:r>
               <w:rPr>
+                <w:rFonts w:ascii="Noto Sans CJK KR" w:hAnsi="Noto Sans CJK KR" w:eastAsia="Noto Sans CJK KR" w:cs="Noto Sans CJK KR"/>
                 <w:b w:val="false"/>
                 <w:bCs w:val="false"/>
               </w:rPr>
@@ -4163,10 +4366,11 @@
             </w:pPr>
             <w:r>
               <w:rPr>
-                <w:b w:val="false"/>
-                <w:bCs w:val="false"/>
-              </w:rPr>
-              <w:t xml:space="preserve">63건 전부 기록</w:t>
+                <w:rFonts w:ascii="Noto Sans CJK KR" w:hAnsi="Noto Sans CJK KR" w:eastAsia="Noto Sans CJK KR" w:cs="Noto Sans CJK KR"/>
+                <w:b w:val="false"/>
+                <w:bCs w:val="false"/>
+              </w:rPr>
+              <w:t xml:space="preserve">64건 전부 기록</w:t>
             </w:r>
           </w:p>
         </w:tc>
@@ -4195,6 +4399,7 @@
             </w:pPr>
             <w:r>
               <w:rPr>
+                <w:rFonts w:ascii="Noto Sans CJK KR" w:hAnsi="Noto Sans CJK KR" w:eastAsia="Noto Sans CJK KR" w:cs="Noto Sans CJK KR"/>
                 <w:b w:val="false"/>
                 <w:bCs w:val="false"/>
               </w:rPr>
@@ -4225,6 +4430,7 @@
             </w:pPr>
             <w:r>
               <w:rPr>
+                <w:rFonts w:ascii="Noto Sans CJK KR" w:hAnsi="Noto Sans CJK KR" w:eastAsia="Noto Sans CJK KR" w:cs="Noto Sans CJK KR"/>
                 <w:b w:val="false"/>
                 <w:bCs w:val="false"/>
               </w:rPr>
@@ -4257,6 +4463,7 @@
             </w:pPr>
             <w:r>
               <w:rPr>
+                <w:rFonts w:ascii="Noto Sans CJK KR" w:hAnsi="Noto Sans CJK KR" w:eastAsia="Noto Sans CJK KR" w:cs="Noto Sans CJK KR"/>
                 <w:b w:val="false"/>
                 <w:bCs w:val="false"/>
               </w:rPr>
@@ -4287,6 +4494,7 @@
             </w:pPr>
             <w:r>
               <w:rPr>
+                <w:rFonts w:ascii="Noto Sans CJK KR" w:hAnsi="Noto Sans CJK KR" w:eastAsia="Noto Sans CJK KR" w:cs="Noto Sans CJK KR"/>
                 <w:b w:val="false"/>
                 <w:bCs w:val="false"/>
               </w:rPr>
@@ -4303,6 +4511,7 @@
       </w:pPr>
       <w:r>
         <w:rPr>
+          <w:rFonts w:ascii="Noto Sans CJK KR" w:hAnsi="Noto Sans CJK KR" w:eastAsia="Noto Sans CJK KR" w:cs="Noto Sans CJK KR"/>
           <w:b w:val="false"/>
           <w:bCs w:val="false"/>
         </w:rPr>
@@ -4317,6 +4526,9 @@
         </w:pBdr>
       </w:pPr>
       <w:r>
+        <w:rPr>
+          <w:rFonts w:ascii="Noto Sans CJK KR" w:hAnsi="Noto Sans CJK KR" w:eastAsia="Noto Sans CJK KR" w:cs="Noto Sans CJK KR"/>
+        </w:rPr>
         <w:t xml:space="preserve">10. ESG 임팩트와 측정계획</w:t>
       </w:r>
     </w:p>
@@ -4365,6 +4577,7 @@
             </w:pPr>
             <w:r>
               <w:rPr>
+                <w:rFonts w:ascii="Noto Sans CJK KR" w:hAnsi="Noto Sans CJK KR" w:eastAsia="Noto Sans CJK KR" w:cs="Noto Sans CJK KR"/>
                 <w:b/>
                 <w:bCs/>
               </w:rPr>
@@ -4396,6 +4609,7 @@
             </w:pPr>
             <w:r>
               <w:rPr>
+                <w:rFonts w:ascii="Noto Sans CJK KR" w:hAnsi="Noto Sans CJK KR" w:eastAsia="Noto Sans CJK KR" w:cs="Noto Sans CJK KR"/>
                 <w:b/>
                 <w:bCs/>
               </w:rPr>
@@ -4427,6 +4641,7 @@
             </w:pPr>
             <w:r>
               <w:rPr>
+                <w:rFonts w:ascii="Noto Sans CJK KR" w:hAnsi="Noto Sans CJK KR" w:eastAsia="Noto Sans CJK KR" w:cs="Noto Sans CJK KR"/>
                 <w:b/>
                 <w:bCs/>
               </w:rPr>
@@ -4459,6 +4674,7 @@
             </w:pPr>
             <w:r>
               <w:rPr>
+                <w:rFonts w:ascii="Noto Sans CJK KR" w:hAnsi="Noto Sans CJK KR" w:eastAsia="Noto Sans CJK KR" w:cs="Noto Sans CJK KR"/>
                 <w:b w:val="false"/>
                 <w:bCs w:val="false"/>
               </w:rPr>
@@ -4489,6 +4705,7 @@
             </w:pPr>
             <w:r>
               <w:rPr>
+                <w:rFonts w:ascii="Noto Sans CJK KR" w:hAnsi="Noto Sans CJK KR" w:eastAsia="Noto Sans CJK KR" w:cs="Noto Sans CJK KR"/>
                 <w:b w:val="false"/>
                 <w:bCs w:val="false"/>
               </w:rPr>
@@ -4519,6 +4736,7 @@
             </w:pPr>
             <w:r>
               <w:rPr>
+                <w:rFonts w:ascii="Noto Sans CJK KR" w:hAnsi="Noto Sans CJK KR" w:eastAsia="Noto Sans CJK KR" w:cs="Noto Sans CJK KR"/>
                 <w:b w:val="false"/>
                 <w:bCs w:val="false"/>
               </w:rPr>
@@ -4551,6 +4769,7 @@
             </w:pPr>
             <w:r>
               <w:rPr>
+                <w:rFonts w:ascii="Noto Sans CJK KR" w:hAnsi="Noto Sans CJK KR" w:eastAsia="Noto Sans CJK KR" w:cs="Noto Sans CJK KR"/>
                 <w:b w:val="false"/>
                 <w:bCs w:val="false"/>
               </w:rPr>
@@ -4581,6 +4800,7 @@
             </w:pPr>
             <w:r>
               <w:rPr>
+                <w:rFonts w:ascii="Noto Sans CJK KR" w:hAnsi="Noto Sans CJK KR" w:eastAsia="Noto Sans CJK KR" w:cs="Noto Sans CJK KR"/>
                 <w:b w:val="false"/>
                 <w:bCs w:val="false"/>
               </w:rPr>
@@ -4611,6 +4831,7 @@
             </w:pPr>
             <w:r>
               <w:rPr>
+                <w:rFonts w:ascii="Noto Sans CJK KR" w:hAnsi="Noto Sans CJK KR" w:eastAsia="Noto Sans CJK KR" w:cs="Noto Sans CJK KR"/>
                 <w:b w:val="false"/>
                 <w:bCs w:val="false"/>
               </w:rPr>
@@ -4643,6 +4864,7 @@
             </w:pPr>
             <w:r>
               <w:rPr>
+                <w:rFonts w:ascii="Noto Sans CJK KR" w:hAnsi="Noto Sans CJK KR" w:eastAsia="Noto Sans CJK KR" w:cs="Noto Sans CJK KR"/>
                 <w:b w:val="false"/>
                 <w:bCs w:val="false"/>
               </w:rPr>
@@ -4673,6 +4895,7 @@
             </w:pPr>
             <w:r>
               <w:rPr>
+                <w:rFonts w:ascii="Noto Sans CJK KR" w:hAnsi="Noto Sans CJK KR" w:eastAsia="Noto Sans CJK KR" w:cs="Noto Sans CJK KR"/>
                 <w:b w:val="false"/>
                 <w:bCs w:val="false"/>
               </w:rPr>
@@ -4703,6 +4926,7 @@
             </w:pPr>
             <w:r>
               <w:rPr>
+                <w:rFonts w:ascii="Noto Sans CJK KR" w:hAnsi="Noto Sans CJK KR" w:eastAsia="Noto Sans CJK KR" w:cs="Noto Sans CJK KR"/>
                 <w:b w:val="false"/>
                 <w:bCs w:val="false"/>
               </w:rPr>
@@ -4719,6 +4943,7 @@
       </w:pPr>
       <w:r>
         <w:rPr>
+          <w:rFonts w:ascii="Noto Sans CJK KR" w:hAnsi="Noto Sans CJK KR" w:eastAsia="Noto Sans CJK KR" w:cs="Noto Sans CJK KR"/>
           <w:b w:val="false"/>
           <w:bCs w:val="false"/>
         </w:rPr>
@@ -4733,6 +4958,9 @@
         </w:pBdr>
       </w:pPr>
       <w:r>
+        <w:rPr>
+          <w:rFonts w:ascii="Noto Sans CJK KR" w:hAnsi="Noto Sans CJK KR" w:eastAsia="Noto Sans CJK KR" w:cs="Noto Sans CJK KR"/>
+        </w:rPr>
         <w:t xml:space="preserve">11. 실현 가능성과 확장성</w:t>
       </w:r>
     </w:p>
@@ -4743,6 +4971,7 @@
       </w:pPr>
       <w:r>
         <w:rPr>
+          <w:rFonts w:ascii="Noto Sans CJK KR" w:hAnsi="Noto Sans CJK KR" w:eastAsia="Noto Sans CJK KR" w:cs="Noto Sans CJK KR"/>
           <w:b w:val="false"/>
           <w:bCs w:val="false"/>
         </w:rPr>
@@ -4756,6 +4985,7 @@
       </w:pPr>
       <w:r>
         <w:rPr>
+          <w:rFonts w:ascii="Noto Sans CJK KR" w:hAnsi="Noto Sans CJK KR" w:eastAsia="Noto Sans CJK KR" w:cs="Noto Sans CJK KR"/>
           <w:b w:val="false"/>
           <w:bCs w:val="false"/>
         </w:rPr>
@@ -4770,6 +5000,9 @@
         </w:pBdr>
       </w:pPr>
       <w:r>
+        <w:rPr>
+          <w:rFonts w:ascii="Noto Sans CJK KR" w:hAnsi="Noto Sans CJK KR" w:eastAsia="Noto Sans CJK KR" w:cs="Noto Sans CJK KR"/>
+        </w:rPr>
         <w:t xml:space="preserve">12. 한계와 남은 과제</w:t>
       </w:r>
     </w:p>
@@ -4783,6 +5016,9 @@
         <w:spacing w:after="60"/>
       </w:pPr>
       <w:r>
+        <w:rPr>
+          <w:rFonts w:ascii="Noto Sans CJK KR" w:hAnsi="Noto Sans CJK KR" w:eastAsia="Noto Sans CJK KR" w:cs="Noto Sans CJK KR"/>
+        </w:rPr>
         <w:t xml:space="preserve">문자열 규칙이 모든 자연어 표현을 완전히 이해한다고 주장하지 않는다. 새 표현은 fixture로 먼저 추가한다.</w:t>
       </w:r>
     </w:p>
@@ -4796,6 +5032,9 @@
         <w:spacing w:after="60"/>
       </w:pPr>
       <w:r>
+        <w:rPr>
+          <w:rFonts w:ascii="Noto Sans CJK KR" w:hAnsi="Noto Sans CJK KR" w:eastAsia="Noto Sans CJK KR" w:cs="Noto Sans CJK KR"/>
+        </w:rPr>
         <w:t xml:space="preserve">공개 자료와 기준일이 있는 지식을 사용하며 최신 법률·제도·시세를 자동 보증하지 않는다.</w:t>
       </w:r>
     </w:p>
@@ -4809,6 +5048,9 @@
         <w:spacing w:after="60"/>
       </w:pPr>
       <w:r>
+        <w:rPr>
+          <w:rFonts w:ascii="Noto Sans CJK KR" w:hAnsi="Noto Sans CJK KR" w:eastAsia="Noto Sans CJK KR" w:cs="Noto Sans CJK KR"/>
+        </w:rPr>
         <w:t xml:space="preserve">실제 tCO2e 계산에는 공식 배출계수와 활동자료 검증이 추가로 필요하다.</w:t>
       </w:r>
     </w:p>
@@ -4822,6 +5064,9 @@
         <w:spacing w:after="60"/>
       </w:pPr>
       <w:r>
+        <w:rPr>
+          <w:rFonts w:ascii="Noto Sans CJK KR" w:hAnsi="Noto Sans CJK KR" w:eastAsia="Noto Sans CJK KR" w:cs="Noto Sans CJK KR"/>
+        </w:rPr>
         <w:t xml:space="preserve">실제 구매·결제·등록부 이전·소각·계약·세무·인증·공시 최종판단은 사람과 기관에 남긴다.</w:t>
       </w:r>
     </w:p>
@@ -4835,6 +5080,9 @@
         <w:spacing w:after="60"/>
       </w:pPr>
       <w:r>
+        <w:rPr>
+          <w:rFonts w:ascii="Noto Sans CJK KR" w:hAnsi="Noto Sans CJK KR" w:eastAsia="Noto Sans CJK KR" w:cs="Noto Sans CJK KR"/>
+        </w:rPr>
         <w:t xml:space="preserve">수페스타 캐릭터는 해커톤 검증용 비공식 MVP로 표시하며 사용 허용 범위를 별도 확인한다.</w:t>
       </w:r>
     </w:p>
@@ -4848,6 +5096,9 @@
         <w:spacing w:after="60"/>
       </w:pPr>
       <w:r>
+        <w:rPr>
+          <w:rFonts w:ascii="Noto Sans CJK KR" w:hAnsi="Noto Sans CJK KR" w:eastAsia="Noto Sans CJK KR" w:cs="Noto Sans CJK KR"/>
+        </w:rPr>
         <w:t xml:space="preserve">임시 터널 주소는 영구 서비스 URL로 주장하지 않는다.</w:t>
       </w:r>
     </w:p>
@@ -4859,6 +5110,9 @@
         </w:pBdr>
       </w:pPr>
       <w:r>
+        <w:rPr>
+          <w:rFonts w:ascii="Noto Sans CJK KR" w:hAnsi="Noto Sans CJK KR" w:eastAsia="Noto Sans CJK KR" w:cs="Noto Sans CJK KR"/>
+        </w:rPr>
         <w:t xml:space="preserve">13. 기술스택</w:t>
       </w:r>
     </w:p>
@@ -4906,6 +5160,7 @@
             </w:pPr>
             <w:r>
               <w:rPr>
+                <w:rFonts w:ascii="Noto Sans CJK KR" w:hAnsi="Noto Sans CJK KR" w:eastAsia="Noto Sans CJK KR" w:cs="Noto Sans CJK KR"/>
                 <w:b/>
                 <w:bCs/>
               </w:rPr>
@@ -4937,6 +5192,7 @@
             </w:pPr>
             <w:r>
               <w:rPr>
+                <w:rFonts w:ascii="Noto Sans CJK KR" w:hAnsi="Noto Sans CJK KR" w:eastAsia="Noto Sans CJK KR" w:cs="Noto Sans CJK KR"/>
                 <w:b/>
                 <w:bCs/>
               </w:rPr>
@@ -4969,6 +5225,7 @@
             </w:pPr>
             <w:r>
               <w:rPr>
+                <w:rFonts w:ascii="Noto Sans CJK KR" w:hAnsi="Noto Sans CJK KR" w:eastAsia="Noto Sans CJK KR" w:cs="Noto Sans CJK KR"/>
                 <w:b w:val="false"/>
                 <w:bCs w:val="false"/>
               </w:rPr>
@@ -4999,6 +5256,7 @@
             </w:pPr>
             <w:r>
               <w:rPr>
+                <w:rFonts w:ascii="Noto Sans CJK KR" w:hAnsi="Noto Sans CJK KR" w:eastAsia="Noto Sans CJK KR" w:cs="Noto Sans CJK KR"/>
                 <w:b w:val="false"/>
                 <w:bCs w:val="false"/>
               </w:rPr>
@@ -5031,6 +5289,7 @@
             </w:pPr>
             <w:r>
               <w:rPr>
+                <w:rFonts w:ascii="Noto Sans CJK KR" w:hAnsi="Noto Sans CJK KR" w:eastAsia="Noto Sans CJK KR" w:cs="Noto Sans CJK KR"/>
                 <w:b w:val="false"/>
                 <w:bCs w:val="false"/>
               </w:rPr>
@@ -5061,6 +5320,7 @@
             </w:pPr>
             <w:r>
               <w:rPr>
+                <w:rFonts w:ascii="Noto Sans CJK KR" w:hAnsi="Noto Sans CJK KR" w:eastAsia="Noto Sans CJK KR" w:cs="Noto Sans CJK KR"/>
                 <w:b w:val="false"/>
                 <w:bCs w:val="false"/>
               </w:rPr>
@@ -5093,6 +5353,7 @@
             </w:pPr>
             <w:r>
               <w:rPr>
+                <w:rFonts w:ascii="Noto Sans CJK KR" w:hAnsi="Noto Sans CJK KR" w:eastAsia="Noto Sans CJK KR" w:cs="Noto Sans CJK KR"/>
                 <w:b w:val="false"/>
                 <w:bCs w:val="false"/>
               </w:rPr>
@@ -5123,6 +5384,7 @@
             </w:pPr>
             <w:r>
               <w:rPr>
+                <w:rFonts w:ascii="Noto Sans CJK KR" w:hAnsi="Noto Sans CJK KR" w:eastAsia="Noto Sans CJK KR" w:cs="Noto Sans CJK KR"/>
                 <w:b w:val="false"/>
                 <w:bCs w:val="false"/>
               </w:rPr>
@@ -5155,6 +5417,7 @@
             </w:pPr>
             <w:r>
               <w:rPr>
+                <w:rFonts w:ascii="Noto Sans CJK KR" w:hAnsi="Noto Sans CJK KR" w:eastAsia="Noto Sans CJK KR" w:cs="Noto Sans CJK KR"/>
                 <w:b w:val="false"/>
                 <w:bCs w:val="false"/>
               </w:rPr>
@@ -5185,6 +5448,7 @@
             </w:pPr>
             <w:r>
               <w:rPr>
+                <w:rFonts w:ascii="Noto Sans CJK KR" w:hAnsi="Noto Sans CJK KR" w:eastAsia="Noto Sans CJK KR" w:cs="Noto Sans CJK KR"/>
                 <w:b w:val="false"/>
                 <w:bCs w:val="false"/>
               </w:rPr>
@@ -5217,6 +5481,7 @@
             </w:pPr>
             <w:r>
               <w:rPr>
+                <w:rFonts w:ascii="Noto Sans CJK KR" w:hAnsi="Noto Sans CJK KR" w:eastAsia="Noto Sans CJK KR" w:cs="Noto Sans CJK KR"/>
                 <w:b w:val="false"/>
                 <w:bCs w:val="false"/>
               </w:rPr>
@@ -5247,6 +5512,7 @@
             </w:pPr>
             <w:r>
               <w:rPr>
+                <w:rFonts w:ascii="Noto Sans CJK KR" w:hAnsi="Noto Sans CJK KR" w:eastAsia="Noto Sans CJK KR" w:cs="Noto Sans CJK KR"/>
                 <w:b w:val="false"/>
                 <w:bCs w:val="false"/>
               </w:rPr>
@@ -5279,6 +5545,7 @@
             </w:pPr>
             <w:r>
               <w:rPr>
+                <w:rFonts w:ascii="Noto Sans CJK KR" w:hAnsi="Noto Sans CJK KR" w:eastAsia="Noto Sans CJK KR" w:cs="Noto Sans CJK KR"/>
                 <w:b w:val="false"/>
                 <w:bCs w:val="false"/>
               </w:rPr>
@@ -5309,10 +5576,11 @@
             </w:pPr>
             <w:r>
               <w:rPr>
-                <w:b w:val="false"/>
-                <w:bCs w:val="false"/>
-              </w:rPr>
-              <w:t xml:space="preserve">자동 테스트 35개, 결정론 fixture 63개, 로컬 AI fixture 10개, 대화 이력 격리, Context conflict 검사, Output Risk Gate</w:t>
+                <w:rFonts w:ascii="Noto Sans CJK KR" w:hAnsi="Noto Sans CJK KR" w:eastAsia="Noto Sans CJK KR" w:cs="Noto Sans CJK KR"/>
+                <w:b w:val="false"/>
+                <w:bCs w:val="false"/>
+              </w:rPr>
+              <w:t xml:space="preserve">자동 테스트 36개, 결정론 fixture 64개, 로컬 AI fixture 10개, 공개 Qwen 5건, 대화 이력 격리, Context conflict 검사, Output Risk Gate</w:t>
             </w:r>
           </w:p>
         </w:tc>
@@ -5341,6 +5609,7 @@
             </w:pPr>
             <w:r>
               <w:rPr>
+                <w:rFonts w:ascii="Noto Sans CJK KR" w:hAnsi="Noto Sans CJK KR" w:eastAsia="Noto Sans CJK KR" w:cs="Noto Sans CJK KR"/>
                 <w:b w:val="false"/>
                 <w:bCs w:val="false"/>
               </w:rPr>
@@ -5371,10 +5640,11 @@
             </w:pPr>
             <w:r>
               <w:rPr>
-                <w:b w:val="false"/>
-                <w:bCs w:val="false"/>
-              </w:rPr>
-              <w:t xml:space="preserve">Local runtime, Docker, 필요 시 검증된 공개 터널</w:t>
+                <w:rFonts w:ascii="Noto Sans CJK KR" w:hAnsi="Noto Sans CJK KR" w:eastAsia="Noto Sans CJK KR" w:cs="Noto Sans CJK KR"/>
+                <w:b w:val="false"/>
+                <w:bCs w:val="false"/>
+              </w:rPr>
+              <w:t xml:space="preserve">Local runtime, Render Docker 공개 데모, Qwen Cloud 선택 연동</w:t>
             </w:r>
           </w:p>
         </w:tc>
@@ -5388,6 +5658,9 @@
         </w:pBdr>
       </w:pPr>
       <w:r>
+        <w:rPr>
+          <w:rFonts w:ascii="Noto Sans CJK KR" w:hAnsi="Noto Sans CJK KR" w:eastAsia="Noto Sans CJK KR" w:cs="Noto Sans CJK KR"/>
+        </w:rPr>
         <w:t xml:space="preserve">14. 근거 자료</w:t>
       </w:r>
     </w:p>
@@ -5397,6 +5670,7 @@
       </w:pPr>
       <w:r>
         <w:rPr>
+          <w:rFonts w:ascii="Noto Sans CJK KR" w:hAnsi="Noto Sans CJK KR" w:eastAsia="Noto Sans CJK KR" w:cs="Noto Sans CJK KR"/>
           <w:b/>
           <w:bCs/>
           <w:color w:val="1F4E79"/>
@@ -5414,14 +5688,21 @@
         <w:spacing w:after="40"/>
       </w:pPr>
       <w:r>
+        <w:rPr>
+          <w:rFonts w:ascii="Noto Sans CJK KR" w:hAnsi="Noto Sans CJK KR" w:eastAsia="Noto Sans CJK KR" w:cs="Noto Sans CJK KR"/>
+        </w:rPr>
         <w:t xml:space="preserve">2026 ESG × AI 챌린지 해커톤 공식 공고</w:t>
       </w:r>
       <w:r>
+        <w:rPr>
+          <w:rFonts w:ascii="Noto Sans CJK KR" w:hAnsi="Noto Sans CJK KR" w:eastAsia="Noto Sans CJK KR" w:cs="Noto Sans CJK KR"/>
+        </w:rPr>
         <w:t xml:space="preserve">  </w:t>
       </w:r>
       <w:hyperlink w:history="1" r:id="rIdangf4fftia8qodxn7s4ex">
         <w:r>
           <w:rPr>
+            <w:rFonts w:ascii="Noto Sans CJK KR" w:hAnsi="Noto Sans CJK KR" w:eastAsia="Noto Sans CJK KR" w:cs="Noto Sans CJK KR"/>
             <w:color w:val="1F4E79"/>
             <w:u w:val="single"/>
           </w:rPr>
@@ -5439,14 +5720,21 @@
         <w:spacing w:after="40"/>
       </w:pPr>
       <w:r>
+        <w:rPr>
+          <w:rFonts w:ascii="Noto Sans CJK KR" w:hAnsi="Noto Sans CJK KR" w:eastAsia="Noto Sans CJK KR" w:cs="Noto Sans CJK KR"/>
+        </w:rPr>
         <w:t xml:space="preserve">수페스타 프로젝트 공개 저장소</w:t>
       </w:r>
       <w:r>
+        <w:rPr>
+          <w:rFonts w:ascii="Noto Sans CJK KR" w:hAnsi="Noto Sans CJK KR" w:eastAsia="Noto Sans CJK KR" w:cs="Noto Sans CJK KR"/>
+        </w:rPr>
         <w:t xml:space="preserve">  </w:t>
       </w:r>
       <w:hyperlink w:history="1" r:id="rIdSupestarRepo">
         <w:r>
           <w:rPr>
+            <w:rFonts w:ascii="Noto Sans CJK KR" w:hAnsi="Noto Sans CJK KR" w:eastAsia="Noto Sans CJK KR" w:cs="Noto Sans CJK KR"/>
             <w:color w:val="1F4E79"/>
             <w:u w:val="single"/>
           </w:rPr>
@@ -5464,14 +5752,21 @@
         <w:spacing w:after="40"/>
       </w:pPr>
       <w:r>
+        <w:rPr>
+          <w:rFonts w:ascii="Noto Sans CJK KR" w:hAnsi="Noto Sans CJK KR" w:eastAsia="Noto Sans CJK KR" w:cs="Noto Sans CJK KR"/>
+        </w:rPr>
         <w:t xml:space="preserve">Knowledge-Action Chain</w:t>
       </w:r>
       <w:r>
+        <w:rPr>
+          <w:rFonts w:ascii="Noto Sans CJK KR" w:hAnsi="Noto Sans CJK KR" w:eastAsia="Noto Sans CJK KR" w:cs="Noto Sans CJK KR"/>
+        </w:rPr>
         <w:t xml:space="preserve">  </w:t>
       </w:r>
       <w:hyperlink w:history="1" r:id="rIdmozmauq3ix9rmsmx5bxwu">
         <w:r>
           <w:rPr>
+            <w:rFonts w:ascii="Noto Sans CJK KR" w:hAnsi="Noto Sans CJK KR" w:eastAsia="Noto Sans CJK KR" w:cs="Noto Sans CJK KR"/>
             <w:color w:val="1F4E79"/>
             <w:u w:val="single"/>
           </w:rPr>
@@ -5489,14 +5784,21 @@
         <w:spacing w:after="40"/>
       </w:pPr>
       <w:r>
+        <w:rPr>
+          <w:rFonts w:ascii="Noto Sans CJK KR" w:hAnsi="Noto Sans CJK KR" w:eastAsia="Noto Sans CJK KR" w:cs="Noto Sans CJK KR"/>
+        </w:rPr>
         <w:t xml:space="preserve">한국임업진흥원 산림탄소상쇄제도</w:t>
       </w:r>
       <w:r>
+        <w:rPr>
+          <w:rFonts w:ascii="Noto Sans CJK KR" w:hAnsi="Noto Sans CJK KR" w:eastAsia="Noto Sans CJK KR" w:cs="Noto Sans CJK KR"/>
+        </w:rPr>
         <w:t xml:space="preserve">  </w:t>
       </w:r>
       <w:hyperlink w:history="1" r:id="rIdjtahlvmtlxkujszvbunzj">
         <w:r>
           <w:rPr>
+            <w:rFonts w:ascii="Noto Sans CJK KR" w:hAnsi="Noto Sans CJK KR" w:eastAsia="Noto Sans CJK KR" w:cs="Noto Sans CJK KR"/>
             <w:color w:val="1F4E79"/>
             <w:u w:val="single"/>
           </w:rPr>
@@ -5514,14 +5816,21 @@
         <w:spacing w:after="40"/>
       </w:pPr>
       <w:r>
+        <w:rPr>
+          <w:rFonts w:ascii="Noto Sans CJK KR" w:hAnsi="Noto Sans CJK KR" w:eastAsia="Noto Sans CJK KR" w:cs="Noto Sans CJK KR"/>
+        </w:rPr>
         <w:t xml:space="preserve">산림탄소등록부</w:t>
       </w:r>
       <w:r>
+        <w:rPr>
+          <w:rFonts w:ascii="Noto Sans CJK KR" w:hAnsi="Noto Sans CJK KR" w:eastAsia="Noto Sans CJK KR" w:cs="Noto Sans CJK KR"/>
+        </w:rPr>
         <w:t xml:space="preserve">  </w:t>
       </w:r>
       <w:hyperlink w:history="1" r:id="rIdw8aabmtz7m-1zwrb1u4xg">
         <w:r>
           <w:rPr>
+            <w:rFonts w:ascii="Noto Sans CJK KR" w:hAnsi="Noto Sans CJK KR" w:eastAsia="Noto Sans CJK KR" w:cs="Noto Sans CJK KR"/>
             <w:color w:val="1F4E79"/>
             <w:u w:val="single"/>
           </w:rPr>
@@ -5539,14 +5848,21 @@
         <w:spacing w:after="40"/>
       </w:pPr>
       <w:r>
+        <w:rPr>
+          <w:rFonts w:ascii="Noto Sans CJK KR" w:hAnsi="Noto Sans CJK KR" w:eastAsia="Noto Sans CJK KR" w:cs="Noto Sans CJK KR"/>
+        </w:rPr>
         <w:t xml:space="preserve">산림탄소마켓</w:t>
       </w:r>
       <w:r>
+        <w:rPr>
+          <w:rFonts w:ascii="Noto Sans CJK KR" w:hAnsi="Noto Sans CJK KR" w:eastAsia="Noto Sans CJK KR" w:cs="Noto Sans CJK KR"/>
+        </w:rPr>
         <w:t xml:space="preserve">  </w:t>
       </w:r>
       <w:hyperlink w:history="1" r:id="rIdxwcrqipb38e54mcebawaj">
         <w:r>
           <w:rPr>
+            <w:rFonts w:ascii="Noto Sans CJK KR" w:hAnsi="Noto Sans CJK KR" w:eastAsia="Noto Sans CJK KR" w:cs="Noto Sans CJK KR"/>
             <w:color w:val="1F4E79"/>
             <w:u w:val="single"/>
           </w:rPr>
@@ -5564,14 +5880,21 @@
         <w:spacing w:after="40"/>
       </w:pPr>
       <w:r>
+        <w:rPr>
+          <w:rFonts w:ascii="Noto Sans CJK KR" w:hAnsi="Noto Sans CJK KR" w:eastAsia="Noto Sans CJK KR" w:cs="Noto Sans CJK KR"/>
+        </w:rPr>
         <w:t xml:space="preserve">GHG Protocol</w:t>
       </w:r>
       <w:r>
+        <w:rPr>
+          <w:rFonts w:ascii="Noto Sans CJK KR" w:hAnsi="Noto Sans CJK KR" w:eastAsia="Noto Sans CJK KR" w:cs="Noto Sans CJK KR"/>
+        </w:rPr>
         <w:t xml:space="preserve">  </w:t>
       </w:r>
       <w:hyperlink w:history="1" r:id="rIdmjzh8d_sbumdbjqkmb8ft">
         <w:r>
           <w:rPr>
+            <w:rFonts w:ascii="Noto Sans CJK KR" w:hAnsi="Noto Sans CJK KR" w:eastAsia="Noto Sans CJK KR" w:cs="Noto Sans CJK KR"/>
             <w:color w:val="1F4E79"/>
             <w:u w:val="single"/>
           </w:rPr>
@@ -5589,14 +5912,21 @@
         <w:spacing w:after="40"/>
       </w:pPr>
       <w:r>
+        <w:rPr>
+          <w:rFonts w:ascii="Noto Sans CJK KR" w:hAnsi="Noto Sans CJK KR" w:eastAsia="Noto Sans CJK KR" w:cs="Noto Sans CJK KR"/>
+        </w:rPr>
         <w:t xml:space="preserve">UN Sustainable Development Goals</w:t>
       </w:r>
       <w:r>
+        <w:rPr>
+          <w:rFonts w:ascii="Noto Sans CJK KR" w:hAnsi="Noto Sans CJK KR" w:eastAsia="Noto Sans CJK KR" w:cs="Noto Sans CJK KR"/>
+        </w:rPr>
         <w:t xml:space="preserve">  </w:t>
       </w:r>
       <w:hyperlink w:history="1" r:id="rIdjjr9d0uu3w04g01rmnlmb">
         <w:r>
           <w:rPr>
+            <w:rFonts w:ascii="Noto Sans CJK KR" w:hAnsi="Noto Sans CJK KR" w:eastAsia="Noto Sans CJK KR" w:cs="Noto Sans CJK KR"/>
             <w:color w:val="1F4E79"/>
             <w:u w:val="single"/>
           </w:rPr>
@@ -5644,6 +5974,7 @@
             </w:pPr>
             <w:r>
               <w:rPr>
+                <w:rFonts w:ascii="Noto Sans CJK KR" w:hAnsi="Noto Sans CJK KR" w:eastAsia="Noto Sans CJK KR" w:cs="Noto Sans CJK KR"/>
                 <w:b/>
                 <w:bCs/>
                 <w:color w:val="1F4E79"/>
@@ -5658,6 +5989,7 @@
             </w:pPr>
             <w:r>
               <w:rPr>
+                <w:rFonts w:ascii="Noto Sans CJK KR" w:hAnsi="Noto Sans CJK KR" w:eastAsia="Noto Sans CJK KR" w:cs="Noto Sans CJK KR"/>
                 <w:b/>
                 <w:bCs/>
               </w:rPr>
@@ -5671,6 +6003,7 @@
             </w:pPr>
             <w:r>
               <w:rPr>
+                <w:rFonts w:ascii="Noto Sans CJK KR" w:hAnsi="Noto Sans CJK KR" w:eastAsia="Noto Sans CJK KR" w:cs="Noto Sans CJK KR"/>
                 <w:b/>
                 <w:bCs/>
               </w:rPr>
@@ -5740,7 +6073,7 @@
     </w:pPr>
     <w:r>
       <w:rPr>
-        <w:rFonts w:ascii="Apple SD Gothic Neo" w:cs="Apple SD Gothic Neo" w:eastAsia="Apple SD Gothic Neo" w:hAnsi="Apple SD Gothic Neo"/>
+        <w:rFonts w:ascii="Noto Sans CJK KR" w:cs="Noto Sans CJK KR" w:eastAsia="Noto Sans CJK KR" w:hAnsi="Noto Sans CJK KR"/>
         <w:color w:val="808080"/>
         <w:sz w:val="18"/>
         <w:szCs w:val="18"/>
@@ -5927,7 +6260,7 @@
   <w:docDefaults>
     <w:rPrDefault>
       <w:rPr>
-        <w:rFonts w:ascii="Apple SD Gothic Neo" w:cs="Apple SD Gothic Neo" w:eastAsia="Apple SD Gothic Neo" w:hAnsi="Apple SD Gothic Neo"/>
+        <w:rFonts w:ascii="Noto Sans CJK KR" w:cs="Noto Sans CJK KR" w:eastAsia="Noto Sans CJK KR" w:hAnsi="Noto Sans CJK KR"/>
         <w:color w:val="1A1A1A"/>
         <w:sz w:val="21"/>
         <w:szCs w:val="21"/>
@@ -6116,7 +6449,7 @@
       <w:outlineLvl w:val="0"/>
     </w:pPr>
     <w:rPr>
-      <w:rFonts w:ascii="Apple SD Gothic Neo" w:cs="Apple SD Gothic Neo" w:eastAsia="Apple SD Gothic Neo" w:hAnsi="Apple SD Gothic Neo"/>
+      <w:rFonts w:ascii="Noto Sans CJK KR" w:cs="Noto Sans CJK KR" w:eastAsia="Noto Sans CJK KR" w:hAnsi="Noto Sans CJK KR"/>
       <w:b/>
       <w:bCs/>
       <w:color w:val="1F4E79"/>
@@ -6134,7 +6467,7 @@
       <w:outlineLvl w:val="1"/>
     </w:pPr>
     <w:rPr>
-      <w:rFonts w:ascii="Apple SD Gothic Neo" w:cs="Apple SD Gothic Neo" w:eastAsia="Apple SD Gothic Neo" w:hAnsi="Apple SD Gothic Neo"/>
+      <w:rFonts w:ascii="Noto Sans CJK KR" w:cs="Noto Sans CJK KR" w:eastAsia="Noto Sans CJK KR" w:hAnsi="Noto Sans CJK KR"/>
       <w:b/>
       <w:bCs/>
       <w:color w:val="1F4E79"/>
@@ -6152,7 +6485,7 @@
       <w:outlineLvl w:val="2"/>
     </w:pPr>
     <w:rPr>
-      <w:rFonts w:ascii="Apple SD Gothic Neo" w:cs="Apple SD Gothic Neo" w:eastAsia="Apple SD Gothic Neo" w:hAnsi="Apple SD Gothic Neo"/>
+      <w:rFonts w:ascii="Noto Sans CJK KR" w:cs="Noto Sans CJK KR" w:eastAsia="Noto Sans CJK KR" w:hAnsi="Noto Sans CJK KR"/>
       <w:b/>
       <w:bCs/>
       <w:color w:val="1A1A1A"/>

</xml_diff>